<commit_message>
fix: ODF fields, list headers, row groups and ODS cell text; PPTX alternate-content shapes
- ODF paragraphs read the text of fields (dates, sequence numbers,
  cross-references, author names), text:meta and ruby (base with its
  reading in parentheses), which were dropped.
- ODF lists read text:list-header paragraphs; tables read rows in
  table:table-rows and nested table:table-row-group.
- ODS cell paragraphs are read as inline content: text around a
  formatted span, spaces, line breaks and links were dropped whenever
  a paragraph held a span. The cell's frames are still read once, by
  the cell.
- text:tracked-changes (a deletion's removed text) is not read as body.
- PPTX shape trees read the first branch of mc:AlternateContent.
- Parity test: ODS cells that only anchor a drawing are not counted
  against XLSX, which draws outside the grid.
</commit_message>
<xml_diff>
--- a/test/generator/baseline/gen.ods.to.docx.docx
+++ b/test/generator/baseline/gen.ods.to.docx.docx
@@ -46,6 +46,11 @@
           </w:tcPr>
           <w:p>
             <w:r>
+              <w:t xml:space="preserve">This document demonstrates the ability of the </w:t>
+            </w:r>
+          </w:p>
+          <w:p>
+            <w:r>
               <w:rPr>
                 <w:rFonts w:ascii="Ubuntu" w:hAnsi="Ubuntu"/>
                 <w:color w:val="000000"/>
@@ -54,6 +59,11 @@
               <w:t xml:space="preserve">calibre</w:t>
             </w:r>
           </w:p>
+          <w:p>
+            <w:r>
+              <w:t xml:space="preserve"> DOCX Input plugin to convert the various typographic features in a Microsoft Word (2007 and newer) document. Convert this document to a modern ebook format, such as AZW3 for Kindles or EPUB for other ebook readers, to see it in action. </w:t>
+            </w:r>
+          </w:p>
         </w:tc>
       </w:tr>
       <w:tr>
@@ -73,6 +83,11 @@
           <w:tcPr>
             <w:tcW w:w="0" w:type="auto"/>
           </w:tcPr>
+          <w:p>
+            <w:r>
+              <w:t xml:space="preserve">To see the DOCX conversion in action, simply add this file to calibre using the </w:t>
+            </w:r>
+          </w:p>
           <w:p>
             <w:r>
               <w:rPr>
@@ -86,6 +101,11 @@
           </w:p>
           <w:p>
             <w:r>
+              <w:t xml:space="preserve">button and then click “</w:t>
+            </w:r>
+          </w:p>
+          <w:p>
+            <w:r>
               <w:rPr>
                 <w:rFonts w:ascii="Ubuntu" w:hAnsi="Ubuntu"/>
                 <w:b/>
@@ -97,6 +117,11 @@
           </w:p>
           <w:p>
             <w:r>
+              <w:t xml:space="preserve"> Set the output format in the top right corner of the conversion dialog to EPUB or AZW3 and click </w:t>
+            </w:r>
+          </w:p>
+          <w:p>
+            <w:r>
               <w:rPr>
                 <w:rFonts w:ascii="Ubuntu" w:hAnsi="Ubuntu"/>
                 <w:b/>
@@ -104,6 +129,11 @@
                 <w:sz w:val="24"/>
               </w:rPr>
               <w:t xml:space="preserve">“OK”</w:t>
+            </w:r>
+          </w:p>
+          <w:p>
+            <w:r>
+              <w:t xml:space="preserve">. </w:t>
             </w:r>
           </w:p>
         </w:tc>
@@ -2373,6 +2403,11 @@
           </w:tcPr>
           <w:p>
             <w:r>
+              <w:t xml:space="preserve">A paragraph with styled text: </w:t>
+            </w:r>
+          </w:p>
+          <w:p>
+            <w:r>
               <w:rPr>
                 <w:rFonts w:ascii="Ubuntu" w:hAnsi="Ubuntu"/>
                 <w:i/>
@@ -2384,6 +2419,11 @@
           </w:p>
           <w:p>
             <w:r>
+              <w:t xml:space="preserve">followed by </w:t>
+            </w:r>
+          </w:p>
+          <w:p>
+            <w:r>
               <w:rPr>
                 <w:rFonts w:ascii="Ubuntu" w:hAnsi="Ubuntu"/>
                 <w:b/>
@@ -2391,6 +2431,11 @@
                 <w:sz w:val="24"/>
               </w:rPr>
               <w:t xml:space="preserve">strong text </w:t>
+            </w:r>
+          </w:p>
+          <w:p>
+            <w:r>
+              <w:t xml:space="preserve">and </w:t>
             </w:r>
           </w:p>
           <w:p>
@@ -2405,6 +2450,11 @@
               <w:t xml:space="preserve">intense emphasis</w:t>
             </w:r>
           </w:p>
+          <w:p>
+            <w:r>
+              <w:t xml:space="preserve">. This paragraph uses document wide styles for styling rather than inline text properties as demonstrated in the previous paragraph — calibre can handle both with equal ease. </w:t>
+            </w:r>
+          </w:p>
         </w:tc>
       </w:tr>
       <w:tr>
@@ -2424,6 +2474,11 @@
           <w:tcPr>
             <w:tcW w:w="0" w:type="auto"/>
           </w:tcPr>
+          <w:p>
+            <w:r>
+              <w:t xml:space="preserve">This document has embedded the Ubuntu font family. The body text is in the Ubuntu typeface, here is </w:t>
+            </w:r>
+          </w:p>
           <w:p>
             <w:r>
               <w:rPr>
@@ -2432,6 +2487,11 @@
                 <w:sz w:val="24"/>
               </w:rPr>
               <w:t xml:space="preserve">some text in the Ubuntu Mono typeface, notice how every letter has the same width, even i and m</w:t>
+            </w:r>
+          </w:p>
+          <w:p>
+            <w:r>
+              <w:t xml:space="preserve">. Every embedded font will automatically be embedded in the output ebook during conversion.  </w:t>
             </w:r>
           </w:p>
         </w:tc>
@@ -3166,6 +3226,11 @@
           </w:tcPr>
           <w:p>
             <w:r>
+              <w:t xml:space="preserve">Undergraduate</w:t>
+            </w:r>
+          </w:p>
+          <w:p>
+            <w:r>
               <w:rPr>
                 <w:rFonts w:ascii="Ubuntu" w:hAnsi="Ubuntu"/>
                 <w:color w:val="808080"/>
@@ -3285,6 +3350,11 @@
           </w:tcPr>
           <w:p>
             <w:r>
+              <w:t xml:space="preserve">Graduate</w:t>
+            </w:r>
+          </w:p>
+          <w:p>
+            <w:r>
               <w:rPr>
                 <w:rFonts w:ascii="Ubuntu" w:hAnsi="Ubuntu"/>
                 <w:color w:val="808080"/>
@@ -3490,6 +3560,11 @@
           <w:tcPr>
             <w:tcW w:w="0" w:type="auto"/>
           </w:tcPr>
+          <w:p>
+            <w:r>
+              <w:t xml:space="preserve">Source:</w:t>
+            </w:r>
+          </w:p>
           <w:p>
             <w:r>
               <w:rPr>
@@ -5017,6 +5092,11 @@
           </w:tcPr>
           <w:p>
             <w:r>
+              <w:t xml:space="preserve">Footnotes</w:t>
+            </w:r>
+          </w:p>
+          <w:p>
+            <w:r>
               <w:rPr>
                 <w:rFonts w:ascii="Ubuntu" w:hAnsi="Ubuntu"/>
                 <w:color w:val="000000"/>
@@ -5027,6 +5107,11 @@
           </w:p>
           <w:p>
             <w:r>
+              <w:t xml:space="preserve"> and endnotes</w:t>
+            </w:r>
+          </w:p>
+          <w:p>
+            <w:r>
               <w:rPr>
                 <w:rFonts w:ascii="Ubuntu" w:hAnsi="Ubuntu"/>
                 <w:color w:val="000000"/>
@@ -5035,6 +5120,11 @@
               <w:t xml:space="preserve">i</w:t>
             </w:r>
           </w:p>
+          <w:p>
+            <w:r>
+              <w:t xml:space="preserve"> are automatically recognized and both are converted to endnotes, with backlinks for maximum ease of use in ebook devices. </w:t>
+            </w:r>
+          </w:p>
         </w:tc>
       </w:tr>
       <w:tr>
@@ -5090,6 +5180,11 @@
           <w:tcPr>
             <w:tcW w:w="0" w:type="auto"/>
           </w:tcPr>
+          <w:p>
+            <w:r>
+              <w:t xml:space="preserve">Two kinds of links are possible, those that refer to an external website and those that refer to locations inside the document itself. Both are supported by calibre. For example, here is a link pointing to the </w:t>
+            </w:r>
+          </w:p>
           <w:p>
             <w:r>
               <w:rPr>
@@ -5103,6 +5198,11 @@
           </w:p>
           <w:p>
             <w:r>
+              <w:t xml:space="preserve">. Then we have a link that points back to the section on </w:t>
+            </w:r>
+          </w:p>
+          <w:p>
+            <w:r>
               <w:rPr>
                 <w:rFonts w:ascii="Ubuntu" w:hAnsi="Ubuntu"/>
                 <w:color w:val="0000FF"/>
@@ -5110,6 +5210,11 @@
                 <w:u w:val="single"/>
               </w:rPr>
               <w:t xml:space="preserve">paragraph level formatting</w:t>
+            </w:r>
+          </w:p>
+          <w:p>
+            <w:r>
+              <w:t xml:space="preserve"> in this document. </w:t>
             </w:r>
           </w:p>
         </w:tc>
@@ -5388,6 +5493,11 @@
           </w:tcPr>
           <w:p>
             <w:r>
+              <w:t xml:space="preserve">There is no analogous technology in ebooks, so the conversion will usually end up placing the image either centered or floating close to the point in the text where it was </w:t>
+            </w:r>
+          </w:p>
+          <w:p>
+            <w:r>
               <w:rPr>
                 <w:rFonts w:ascii="Ubuntu" w:hAnsi="Ubuntu"/>
                 <w:i/>
@@ -5395,6 +5505,11 @@
                 <w:sz w:val="24"/>
               </w:rPr>
               <w:t xml:space="preserve">inserted</w:t>
+            </w:r>
+          </w:p>
+          <w:p>
+            <w:r>
+              <w:t xml:space="preserve">, not necessarily where it appears on the page in Word. </w:t>
             </w:r>
           </w:p>
         </w:tc>

</xml_diff>

<commit_message>
fix(ods): a cell's runs take its style's and their paragraph style's looks
A spreadsheet sets a cell bold (or its font, size, colour) through the cell's style: its runs were
read from their own spans alone, so a bold header cell read plain, and its paragraph style was not
read either.
</commit_message>
<xml_diff>
--- a/test/generator/baseline/gen.ods.to.docx.docx
+++ b/test/generator/baseline/gen.ods.to.docx.docx
@@ -34,6 +34,11 @@
           </w:tcPr>
           <w:p>
             <w:r>
+              <w:rPr>
+                <w:rFonts w:ascii="Ubuntu" w:hAnsi="Ubuntu"/>
+                <w:color w:val="17365D"/>
+                <w:sz w:val="52"/>
+              </w:rPr>
               <w:t xml:space="preserve">Demonstration of DOCX support in calibre </w:t>
             </w:r>
           </w:p>
@@ -46,6 +51,11 @@
           </w:tcPr>
           <w:p>
             <w:r>
+              <w:rPr>
+                <w:rFonts w:ascii="Ubuntu" w:hAnsi="Ubuntu"/>
+                <w:color w:val="000000"/>
+                <w:sz w:val="24"/>
+              </w:rPr>
               <w:t xml:space="preserve">This document demonstrates the ability of the </w:t>
             </w:r>
           </w:p>
@@ -61,6 +71,11 @@
           </w:p>
           <w:p>
             <w:r>
+              <w:rPr>
+                <w:rFonts w:ascii="Ubuntu" w:hAnsi="Ubuntu"/>
+                <w:color w:val="000000"/>
+                <w:sz w:val="24"/>
+              </w:rPr>
               <w:t xml:space="preserve"> DOCX Input plugin to convert the various typographic features in a Microsoft Word (2007 and newer) document. Convert this document to a modern ebook format, such as AZW3 for Kindles or EPUB for other ebook readers, to see it in action. </w:t>
             </w:r>
           </w:p>
@@ -73,6 +88,11 @@
           </w:tcPr>
           <w:p>
             <w:r>
+              <w:rPr>
+                <w:rFonts w:ascii="Ubuntu" w:hAnsi="Ubuntu"/>
+                <w:color w:val="000000"/>
+                <w:sz w:val="24"/>
+              </w:rPr>
               <w:t xml:space="preserve">There is support for images, tables, lists, footnotes, endnotes, links, dropcaps and various types of text and paragraph level formatting. </w:t>
             </w:r>
           </w:p>
@@ -85,6 +105,11 @@
           </w:tcPr>
           <w:p>
             <w:r>
+              <w:rPr>
+                <w:rFonts w:ascii="Ubuntu" w:hAnsi="Ubuntu"/>
+                <w:color w:val="000000"/>
+                <w:sz w:val="24"/>
+              </w:rPr>
               <w:t xml:space="preserve">To see the DOCX conversion in action, simply add this file to calibre using the </w:t>
             </w:r>
           </w:p>
@@ -101,6 +126,11 @@
           </w:p>
           <w:p>
             <w:r>
+              <w:rPr>
+                <w:rFonts w:ascii="Ubuntu" w:hAnsi="Ubuntu"/>
+                <w:color w:val="000000"/>
+                <w:sz w:val="24"/>
+              </w:rPr>
               <w:t xml:space="preserve">button and then click “</w:t>
             </w:r>
           </w:p>
@@ -117,6 +147,11 @@
           </w:p>
           <w:p>
             <w:r>
+              <w:rPr>
+                <w:rFonts w:ascii="Ubuntu" w:hAnsi="Ubuntu"/>
+                <w:color w:val="000000"/>
+                <w:sz w:val="24"/>
+              </w:rPr>
               <w:t xml:space="preserve"> Set the output format in the top right corner of the conversion dialog to EPUB or AZW3 and click </w:t>
             </w:r>
           </w:p>
@@ -133,6 +168,11 @@
           </w:p>
           <w:p>
             <w:r>
+              <w:rPr>
+                <w:rFonts w:ascii="Ubuntu" w:hAnsi="Ubuntu"/>
+                <w:color w:val="000000"/>
+                <w:sz w:val="24"/>
+              </w:rPr>
               <w:t xml:space="preserve">. </w:t>
             </w:r>
           </w:p>
@@ -1789,6 +1829,11 @@
           </w:tcPr>
           <w:p>
             <w:r>
+              <w:rPr>
+                <w:rFonts w:ascii="Ubuntu" w:hAnsi="Ubuntu"/>
+                <w:color w:val="000000"/>
+                <w:sz w:val="24"/>
+              </w:rPr>
               <w:t xml:space="preserve">One, with a very long line to demonstrate that the hanging indent for the list is working correctly </w:t>
             </w:r>
           </w:p>
@@ -1807,6 +1852,11 @@
           </w:tcPr>
           <w:p>
             <w:r>
+              <w:rPr>
+                <w:rFonts w:ascii="Ubuntu" w:hAnsi="Ubuntu"/>
+                <w:color w:val="000000"/>
+                <w:sz w:val="24"/>
+              </w:rPr>
               <w:t xml:space="preserve">Two </w:t>
             </w:r>
           </w:p>
@@ -1839,6 +1889,11 @@
           </w:tcPr>
           <w:p>
             <w:r>
+              <w:rPr>
+                <w:rFonts w:ascii="Ubuntu" w:hAnsi="Ubuntu"/>
+                <w:color w:val="000000"/>
+                <w:sz w:val="24"/>
+              </w:rPr>
               <w:t xml:space="preserve">One </w:t>
             </w:r>
           </w:p>
@@ -1857,6 +1912,11 @@
           </w:tcPr>
           <w:p>
             <w:r>
+              <w:rPr>
+                <w:rFonts w:ascii="Ubuntu" w:hAnsi="Ubuntu"/>
+                <w:color w:val="000000"/>
+                <w:sz w:val="24"/>
+              </w:rPr>
               <w:t xml:space="preserve">Two </w:t>
             </w:r>
           </w:p>
@@ -1875,6 +1935,11 @@
           </w:tcPr>
           <w:p>
             <w:r>
+              <w:rPr>
+                <w:rFonts w:ascii="Ubuntu" w:hAnsi="Ubuntu"/>
+                <w:color w:val="000000"/>
+                <w:sz w:val="24"/>
+              </w:rPr>
               <w:t xml:space="preserve">Three </w:t>
             </w:r>
           </w:p>
@@ -1893,6 +1958,11 @@
           </w:tcPr>
           <w:p>
             <w:r>
+              <w:rPr>
+                <w:rFonts w:ascii="Ubuntu" w:hAnsi="Ubuntu"/>
+                <w:color w:val="000000"/>
+                <w:sz w:val="24"/>
+              </w:rPr>
               <w:t xml:space="preserve">Four with a very long line to demonstrate that the hanging indent for the list is working correctly. </w:t>
             </w:r>
           </w:p>
@@ -1911,6 +1981,11 @@
           </w:tcPr>
           <w:p>
             <w:r>
+              <w:rPr>
+                <w:rFonts w:ascii="Ubuntu" w:hAnsi="Ubuntu"/>
+                <w:color w:val="000000"/>
+                <w:sz w:val="24"/>
+              </w:rPr>
               <w:t xml:space="preserve">Five </w:t>
             </w:r>
           </w:p>
@@ -1929,6 +2004,11 @@
           </w:tcPr>
           <w:p>
             <w:r>
+              <w:rPr>
+                <w:rFonts w:ascii="Ubuntu" w:hAnsi="Ubuntu"/>
+                <w:color w:val="000000"/>
+                <w:sz w:val="24"/>
+              </w:rPr>
               <w:t xml:space="preserve">Six </w:t>
             </w:r>
           </w:p>
@@ -2045,6 +2125,11 @@
           </w:tcPr>
           <w:p>
             <w:r>
+              <w:rPr>
+                <w:rFonts w:ascii="Ubuntu" w:hAnsi="Ubuntu"/>
+                <w:color w:val="000000"/>
+                <w:sz w:val="24"/>
+              </w:rPr>
               <w:t xml:space="preserve">One </w:t>
             </w:r>
           </w:p>
@@ -2063,6 +2148,11 @@
           </w:tcPr>
           <w:p>
             <w:r>
+              <w:rPr>
+                <w:rFonts w:ascii="Ubuntu" w:hAnsi="Ubuntu"/>
+                <w:color w:val="000000"/>
+                <w:sz w:val="24"/>
+              </w:rPr>
               <w:t xml:space="preserve">Two </w:t>
             </w:r>
           </w:p>
@@ -2095,6 +2185,11 @@
           </w:tcPr>
           <w:p>
             <w:r>
+              <w:rPr>
+                <w:rFonts w:ascii="Ubuntu" w:hAnsi="Ubuntu"/>
+                <w:color w:val="000000"/>
+                <w:sz w:val="24"/>
+              </w:rPr>
               <w:t xml:space="preserve">We now resume our normal programming </w:t>
             </w:r>
           </w:p>
@@ -2113,6 +2208,11 @@
           </w:tcPr>
           <w:p>
             <w:r>
+              <w:rPr>
+                <w:rFonts w:ascii="Ubuntu" w:hAnsi="Ubuntu"/>
+                <w:color w:val="000000"/>
+                <w:sz w:val="24"/>
+              </w:rPr>
               <w:t xml:space="preserve">Four </w:t>
             </w:r>
           </w:p>
@@ -2144,12 +2244,21 @@
         <w:gridCol w:w="9026"/>
       </w:tblGrid>
       <w:tr>
-        <w:tc>
-          <w:tcPr>
-            <w:tcW w:w="0" w:type="auto"/>
-          </w:tcPr>
-          <w:p>
-            <w:r>
+        <w:trPr>
+          <w:tblHeader/>
+        </w:trPr>
+        <w:tc>
+          <w:tcPr>
+            <w:tcW w:w="0" w:type="auto"/>
+          </w:tcPr>
+          <w:p>
+            <w:r>
+              <w:rPr>
+                <w:rFonts w:ascii="Ubuntu" w:hAnsi="Ubuntu"/>
+                <w:b/>
+                <w:color w:val="365F91"/>
+                <w:sz w:val="28"/>
+              </w:rPr>
               <w:t xml:space="preserve">Text Formatting </w:t>
             </w:r>
           </w:p>
@@ -2162,6 +2271,12 @@
           </w:tcPr>
           <w:p>
             <w:r>
+              <w:rPr>
+                <w:rFonts w:ascii="Ubuntu" w:hAnsi="Ubuntu"/>
+                <w:b/>
+                <w:color w:val="4F81BD"/>
+                <w:sz w:val="26"/>
+              </w:rPr>
               <w:t xml:space="preserve">Inline formatting </w:t>
             </w:r>
           </w:p>
@@ -2174,6 +2289,11 @@
           </w:tcPr>
           <w:p>
             <w:r>
+              <w:rPr>
+                <w:rFonts w:ascii="Ubuntu" w:hAnsi="Ubuntu"/>
+                <w:color w:val="000000"/>
+                <w:sz w:val="24"/>
+              </w:rPr>
               <w:t xml:space="preserve">Here, we demonstrate various types of inline text formatting and the use of embedded fonts. </w:t>
             </w:r>
           </w:p>
@@ -2379,6 +2499,11 @@
           </w:tcPr>
           <w:p>
             <w:r>
+              <w:rPr>
+                <w:rFonts w:ascii="Ubuntu" w:hAnsi="Ubuntu"/>
+                <w:color w:val="FFFFFF"/>
+                <w:sz w:val="24"/>
+              </w:rPr>
               <w:t xml:space="preserve">inverse video</w:t>
             </w:r>
           </w:p>
@@ -2391,6 +2516,11 @@
           </w:tcPr>
           <w:p>
             <w:r>
+              <w:rPr>
+                <w:rFonts w:ascii="Ubuntu" w:hAnsi="Ubuntu"/>
+                <w:color w:val="000000"/>
+                <w:sz w:val="24"/>
+              </w:rPr>
               <w:t xml:space="preserve">.</w:t>
             </w:r>
           </w:p>
@@ -2403,6 +2533,11 @@
           </w:tcPr>
           <w:p>
             <w:r>
+              <w:rPr>
+                <w:rFonts w:ascii="Ubuntu" w:hAnsi="Ubuntu"/>
+                <w:color w:val="000000"/>
+                <w:sz w:val="24"/>
+              </w:rPr>
               <w:t xml:space="preserve">A paragraph with styled text: </w:t>
             </w:r>
           </w:p>
@@ -2419,6 +2554,11 @@
           </w:p>
           <w:p>
             <w:r>
+              <w:rPr>
+                <w:rFonts w:ascii="Ubuntu" w:hAnsi="Ubuntu"/>
+                <w:color w:val="000000"/>
+                <w:sz w:val="24"/>
+              </w:rPr>
               <w:t xml:space="preserve">followed by </w:t>
             </w:r>
           </w:p>
@@ -2435,6 +2575,11 @@
           </w:p>
           <w:p>
             <w:r>
+              <w:rPr>
+                <w:rFonts w:ascii="Ubuntu" w:hAnsi="Ubuntu"/>
+                <w:color w:val="000000"/>
+                <w:sz w:val="24"/>
+              </w:rPr>
               <w:t xml:space="preserve">and </w:t>
             </w:r>
           </w:p>
@@ -2452,6 +2597,11 @@
           </w:p>
           <w:p>
             <w:r>
+              <w:rPr>
+                <w:rFonts w:ascii="Ubuntu" w:hAnsi="Ubuntu"/>
+                <w:color w:val="000000"/>
+                <w:sz w:val="24"/>
+              </w:rPr>
               <w:t xml:space="preserve">. This paragraph uses document wide styles for styling rather than inline text properties as demonstrated in the previous paragraph — calibre can handle both with equal ease. </w:t>
             </w:r>
           </w:p>
@@ -2464,6 +2614,12 @@
           </w:tcPr>
           <w:p>
             <w:r>
+              <w:rPr>
+                <w:rFonts w:ascii="Ubuntu" w:hAnsi="Ubuntu"/>
+                <w:b/>
+                <w:color w:val="4F81BD"/>
+                <w:sz w:val="26"/>
+              </w:rPr>
               <w:t xml:space="preserve">Fun with fonts </w:t>
             </w:r>
           </w:p>
@@ -2476,6 +2632,11 @@
           </w:tcPr>
           <w:p>
             <w:r>
+              <w:rPr>
+                <w:rFonts w:ascii="Ubuntu" w:hAnsi="Ubuntu"/>
+                <w:color w:val="000000"/>
+                <w:sz w:val="24"/>
+              </w:rPr>
               <w:t xml:space="preserve">This document has embedded the Ubuntu font family. The body text is in the Ubuntu typeface, here is </w:t>
             </w:r>
           </w:p>
@@ -2491,6 +2652,11 @@
           </w:p>
           <w:p>
             <w:r>
+              <w:rPr>
+                <w:rFonts w:ascii="Ubuntu" w:hAnsi="Ubuntu"/>
+                <w:color w:val="000000"/>
+                <w:sz w:val="24"/>
+              </w:rPr>
               <w:t xml:space="preserve">. Every embedded font will automatically be embedded in the output ebook during conversion.  </w:t>
             </w:r>
           </w:p>
@@ -2503,6 +2669,12 @@
           </w:tcPr>
           <w:p>
             <w:r>
+              <w:rPr>
+                <w:rFonts w:ascii="Ubuntu" w:hAnsi="Ubuntu"/>
+                <w:b/>
+                <w:color w:val="4F81BD"/>
+                <w:sz w:val="26"/>
+              </w:rPr>
               <w:t xml:space="preserve">Paragraph level formatting </w:t>
             </w:r>
           </w:p>
@@ -2515,6 +2687,11 @@
           </w:tcPr>
           <w:p>
             <w:r>
+              <w:rPr>
+                <w:rFonts w:ascii="Ubuntu" w:hAnsi="Ubuntu"/>
+                <w:color w:val="000000"/>
+                <w:sz w:val="24"/>
+              </w:rPr>
               <w:t xml:space="preserve">You can do crazy things with paragraphs, if the urge strikes you. For instance this paragraph is right aligned and has a right border. It has also been given a light gray background. </w:t>
             </w:r>
           </w:p>
@@ -2527,6 +2704,11 @@
           </w:tcPr>
           <w:p>
             <w:r>
+              <w:rPr>
+                <w:rFonts w:ascii="Ubuntu" w:hAnsi="Ubuntu"/>
+                <w:color w:val="000000"/>
+                <w:sz w:val="24"/>
+              </w:rPr>
               <w:t xml:space="preserve">For the lovers of poetry amongst you, paragraphs with hanging indents, like this often</w:t>
             </w:r>
           </w:p>
@@ -2537,6 +2719,11 @@
           </w:p>
           <w:p>
             <w:r>
+              <w:rPr>
+                <w:rFonts w:ascii="Ubuntu" w:hAnsi="Ubuntu"/>
+                <w:color w:val="000000"/>
+                <w:sz w:val="24"/>
+              </w:rPr>
               <w:t xml:space="preserve">come in handy. You can use hanging indents to ensure that a line of poetry retains its individual identity as a line even when the screen is  too narrow to display it as a single line. Not only does this paragraph have a hanging indent, it is also has an extra top margin, setting it apart from the preceding paragraph. </w:t>
             </w:r>
           </w:p>
@@ -2573,12 +2760,21 @@
         <w:gridCol w:w="1504"/>
       </w:tblGrid>
       <w:tr>
-        <w:tc>
-          <w:tcPr>
-            <w:tcW w:w="0" w:type="auto"/>
-          </w:tcPr>
-          <w:p>
-            <w:r>
+        <w:trPr>
+          <w:tblHeader/>
+        </w:trPr>
+        <w:tc>
+          <w:tcPr>
+            <w:tcW w:w="0" w:type="auto"/>
+          </w:tcPr>
+          <w:p>
+            <w:r>
+              <w:rPr>
+                <w:rFonts w:ascii="Ubuntu" w:hAnsi="Ubuntu"/>
+                <w:b/>
+                <w:color w:val="365F91"/>
+                <w:sz w:val="28"/>
+              </w:rPr>
               <w:t xml:space="preserve">Tables </w:t>
             </w:r>
           </w:p>
@@ -2591,6 +2787,12 @@
           </w:tcPr>
           <w:p>
             <w:r>
+              <w:rPr>
+                <w:rFonts w:ascii="Ubuntu" w:hAnsi="Ubuntu"/>
+                <w:b/>
+                <w:color w:val="FFFFFF"/>
+                <w:sz w:val="24"/>
+              </w:rPr>
               <w:t xml:space="preserve">ITEM </w:t>
             </w:r>
           </w:p>
@@ -2601,6 +2803,12 @@
           </w:tcPr>
           <w:p>
             <w:r>
+              <w:rPr>
+                <w:rFonts w:ascii="Ubuntu" w:hAnsi="Ubuntu"/>
+                <w:b/>
+                <w:color w:val="FFFFFF"/>
+                <w:sz w:val="24"/>
+              </w:rPr>
               <w:t xml:space="preserve">NEEDED </w:t>
             </w:r>
           </w:p>
@@ -2613,6 +2821,11 @@
           </w:tcPr>
           <w:p>
             <w:r>
+              <w:rPr>
+                <w:rFonts w:ascii="Ubuntu" w:hAnsi="Ubuntu"/>
+                <w:color w:val="000000"/>
+                <w:sz w:val="24"/>
+              </w:rPr>
               <w:t xml:space="preserve">Books </w:t>
             </w:r>
           </w:p>
@@ -2623,6 +2836,11 @@
           </w:tcPr>
           <w:p>
             <w:r>
+              <w:rPr>
+                <w:rFonts w:ascii="Ubuntu" w:hAnsi="Ubuntu"/>
+                <w:color w:val="000000"/>
+                <w:sz w:val="24"/>
+              </w:rPr>
               <w:t xml:space="preserve">1 </w:t>
             </w:r>
           </w:p>
@@ -2635,6 +2853,11 @@
           </w:tcPr>
           <w:p>
             <w:r>
+              <w:rPr>
+                <w:rFonts w:ascii="Ubuntu" w:hAnsi="Ubuntu"/>
+                <w:color w:val="000000"/>
+                <w:sz w:val="24"/>
+              </w:rPr>
               <w:t xml:space="preserve">Pens </w:t>
             </w:r>
           </w:p>
@@ -2645,6 +2868,11 @@
           </w:tcPr>
           <w:p>
             <w:r>
+              <w:rPr>
+                <w:rFonts w:ascii="Ubuntu" w:hAnsi="Ubuntu"/>
+                <w:color w:val="000000"/>
+                <w:sz w:val="24"/>
+              </w:rPr>
               <w:t xml:space="preserve">3 </w:t>
             </w:r>
           </w:p>
@@ -2657,6 +2885,11 @@
           </w:tcPr>
           <w:p>
             <w:r>
+              <w:rPr>
+                <w:rFonts w:ascii="Ubuntu" w:hAnsi="Ubuntu"/>
+                <w:color w:val="000000"/>
+                <w:sz w:val="24"/>
+              </w:rPr>
               <w:t xml:space="preserve">Pencils </w:t>
             </w:r>
           </w:p>
@@ -2667,6 +2900,11 @@
           </w:tcPr>
           <w:p>
             <w:r>
+              <w:rPr>
+                <w:rFonts w:ascii="Ubuntu" w:hAnsi="Ubuntu"/>
+                <w:color w:val="000000"/>
+                <w:sz w:val="24"/>
+              </w:rPr>
               <w:t xml:space="preserve">2 </w:t>
             </w:r>
           </w:p>
@@ -2679,6 +2917,11 @@
           </w:tcPr>
           <w:p>
             <w:r>
+              <w:rPr>
+                <w:rFonts w:ascii="Ubuntu" w:hAnsi="Ubuntu"/>
+                <w:color w:val="000000"/>
+                <w:sz w:val="24"/>
+              </w:rPr>
               <w:t xml:space="preserve">Highlighter </w:t>
             </w:r>
           </w:p>
@@ -2689,6 +2932,11 @@
           </w:tcPr>
           <w:p>
             <w:r>
+              <w:rPr>
+                <w:rFonts w:ascii="Ubuntu" w:hAnsi="Ubuntu"/>
+                <w:color w:val="000000"/>
+                <w:sz w:val="24"/>
+              </w:rPr>
               <w:t xml:space="preserve">2 colors </w:t>
             </w:r>
           </w:p>
@@ -2701,6 +2949,11 @@
           </w:tcPr>
           <w:p>
             <w:r>
+              <w:rPr>
+                <w:rFonts w:ascii="Ubuntu" w:hAnsi="Ubuntu"/>
+                <w:color w:val="000000"/>
+                <w:sz w:val="24"/>
+              </w:rPr>
               <w:t xml:space="preserve">Scissors </w:t>
             </w:r>
           </w:p>
@@ -2711,6 +2964,11 @@
           </w:tcPr>
           <w:p>
             <w:r>
+              <w:rPr>
+                <w:rFonts w:ascii="Ubuntu" w:hAnsi="Ubuntu"/>
+                <w:color w:val="000000"/>
+                <w:sz w:val="24"/>
+              </w:rPr>
               <w:t xml:space="preserve">1 pair </w:t>
             </w:r>
           </w:p>
@@ -2761,6 +3019,11 @@
           </w:tcPr>
           <w:p>
             <w:r>
+              <w:rPr>
+                <w:rFonts w:ascii="Ubuntu" w:hAnsi="Ubuntu"/>
+                <w:color w:val="000000"/>
+                <w:sz w:val="24"/>
+              </w:rPr>
               <w:t xml:space="preserve">Tables in Word can vary from the extremely simple to the extremely complex. calibre tries to do its best when converting tables. While you may run into trouble with the occasional table, the vast majority of common cases should be converted very well, as demonstrated in this section. Note that for optimum results, when creating tables in Word, you should set their widths using percentages, rather than absolute units.  To the left of this paragraph is a floating two column table with a nice green border and header row. </w:t>
             </w:r>
           </w:p>
@@ -2773,6 +3036,11 @@
           </w:tcPr>
           <w:p>
             <w:r>
+              <w:rPr>
+                <w:rFonts w:ascii="Ubuntu" w:hAnsi="Ubuntu"/>
+                <w:color w:val="000000"/>
+                <w:sz w:val="24"/>
+              </w:rPr>
               <w:t xml:space="preserve">Now let’s look at a fancier table—one with alternating row colors and partial borders. This table is stretched out to take 100% of the available width. </w:t>
             </w:r>
           </w:p>
@@ -2785,6 +3053,10 @@
           </w:tcPr>
           <w:p>
             <w:r>
+              <w:rPr>
+                <w:rFonts w:ascii="Ubuntu" w:hAnsi="Ubuntu"/>
+                <w:color w:val="000000"/>
+              </w:rPr>
               <w:t xml:space="preserve">City or Town </w:t>
             </w:r>
           </w:p>
@@ -2795,6 +3067,10 @@
           </w:tcPr>
           <w:p>
             <w:r>
+              <w:rPr>
+                <w:rFonts w:ascii="Ubuntu" w:hAnsi="Ubuntu"/>
+                <w:color w:val="000000"/>
+              </w:rPr>
               <w:t xml:space="preserve">Point A </w:t>
             </w:r>
           </w:p>
@@ -2805,6 +3081,10 @@
           </w:tcPr>
           <w:p>
             <w:r>
+              <w:rPr>
+                <w:rFonts w:ascii="Ubuntu" w:hAnsi="Ubuntu"/>
+                <w:color w:val="000000"/>
+              </w:rPr>
               <w:t xml:space="preserve">Point B </w:t>
             </w:r>
           </w:p>
@@ -2815,6 +3095,10 @@
           </w:tcPr>
           <w:p>
             <w:r>
+              <w:rPr>
+                <w:rFonts w:ascii="Ubuntu" w:hAnsi="Ubuntu"/>
+                <w:color w:val="000000"/>
+              </w:rPr>
               <w:t xml:space="preserve">Point C </w:t>
             </w:r>
           </w:p>
@@ -2825,6 +3109,10 @@
           </w:tcPr>
           <w:p>
             <w:r>
+              <w:rPr>
+                <w:rFonts w:ascii="Ubuntu" w:hAnsi="Ubuntu"/>
+                <w:color w:val="000000"/>
+              </w:rPr>
               <w:t xml:space="preserve">Point D </w:t>
             </w:r>
           </w:p>
@@ -2835,6 +3123,10 @@
           </w:tcPr>
           <w:p>
             <w:r>
+              <w:rPr>
+                <w:rFonts w:ascii="Ubuntu" w:hAnsi="Ubuntu"/>
+                <w:color w:val="000000"/>
+              </w:rPr>
               <w:t xml:space="preserve">Point E </w:t>
             </w:r>
           </w:p>
@@ -2847,6 +3139,11 @@
           </w:tcPr>
           <w:p>
             <w:r>
+              <w:rPr>
+                <w:rFonts w:ascii="Ubuntu" w:hAnsi="Ubuntu"/>
+                <w:color w:val="000000"/>
+                <w:sz w:val="24"/>
+              </w:rPr>
               <w:t xml:space="preserve">Point A </w:t>
             </w:r>
           </w:p>
@@ -2857,6 +3154,11 @@
           </w:tcPr>
           <w:p>
             <w:r>
+              <w:rPr>
+                <w:rFonts w:ascii="Ubuntu" w:hAnsi="Ubuntu"/>
+                <w:color w:val="000000"/>
+                <w:sz w:val="24"/>
+              </w:rPr>
               <w:t xml:space="preserve">— </w:t>
             </w:r>
           </w:p>
@@ -2893,6 +3195,11 @@
           </w:tcPr>
           <w:p>
             <w:r>
+              <w:rPr>
+                <w:rFonts w:ascii="Ubuntu" w:hAnsi="Ubuntu"/>
+                <w:color w:val="000000"/>
+                <w:sz w:val="24"/>
+              </w:rPr>
               <w:t xml:space="preserve">Point B </w:t>
             </w:r>
           </w:p>
@@ -2903,6 +3210,11 @@
           </w:tcPr>
           <w:p>
             <w:r>
+              <w:rPr>
+                <w:rFonts w:ascii="Ubuntu" w:hAnsi="Ubuntu"/>
+                <w:color w:val="000000"/>
+                <w:sz w:val="24"/>
+              </w:rPr>
               <w:t xml:space="preserve">87 </w:t>
             </w:r>
           </w:p>
@@ -2913,6 +3225,11 @@
           </w:tcPr>
           <w:p>
             <w:r>
+              <w:rPr>
+                <w:rFonts w:ascii="Ubuntu" w:hAnsi="Ubuntu"/>
+                <w:color w:val="000000"/>
+                <w:sz w:val="24"/>
+              </w:rPr>
               <w:t xml:space="preserve">— </w:t>
             </w:r>
           </w:p>
@@ -2943,6 +3260,11 @@
           </w:tcPr>
           <w:p>
             <w:r>
+              <w:rPr>
+                <w:rFonts w:ascii="Ubuntu" w:hAnsi="Ubuntu"/>
+                <w:color w:val="000000"/>
+                <w:sz w:val="24"/>
+              </w:rPr>
               <w:t xml:space="preserve">Point C </w:t>
             </w:r>
           </w:p>
@@ -2953,6 +3275,11 @@
           </w:tcPr>
           <w:p>
             <w:r>
+              <w:rPr>
+                <w:rFonts w:ascii="Ubuntu" w:hAnsi="Ubuntu"/>
+                <w:color w:val="000000"/>
+                <w:sz w:val="24"/>
+              </w:rPr>
               <w:t xml:space="preserve">64 </w:t>
             </w:r>
           </w:p>
@@ -2963,6 +3290,11 @@
           </w:tcPr>
           <w:p>
             <w:r>
+              <w:rPr>
+                <w:rFonts w:ascii="Ubuntu" w:hAnsi="Ubuntu"/>
+                <w:color w:val="000000"/>
+                <w:sz w:val="24"/>
+              </w:rPr>
               <w:t xml:space="preserve">56 </w:t>
             </w:r>
           </w:p>
@@ -2973,6 +3305,11 @@
           </w:tcPr>
           <w:p>
             <w:r>
+              <w:rPr>
+                <w:rFonts w:ascii="Ubuntu" w:hAnsi="Ubuntu"/>
+                <w:color w:val="000000"/>
+                <w:sz w:val="24"/>
+              </w:rPr>
               <w:t xml:space="preserve">— </w:t>
             </w:r>
           </w:p>
@@ -2997,6 +3334,11 @@
           </w:tcPr>
           <w:p>
             <w:r>
+              <w:rPr>
+                <w:rFonts w:ascii="Ubuntu" w:hAnsi="Ubuntu"/>
+                <w:color w:val="000000"/>
+                <w:sz w:val="24"/>
+              </w:rPr>
               <w:t xml:space="preserve">Point D </w:t>
             </w:r>
           </w:p>
@@ -3007,6 +3349,11 @@
           </w:tcPr>
           <w:p>
             <w:r>
+              <w:rPr>
+                <w:rFonts w:ascii="Ubuntu" w:hAnsi="Ubuntu"/>
+                <w:color w:val="000000"/>
+                <w:sz w:val="24"/>
+              </w:rPr>
               <w:t xml:space="preserve">37 </w:t>
             </w:r>
           </w:p>
@@ -3017,6 +3364,11 @@
           </w:tcPr>
           <w:p>
             <w:r>
+              <w:rPr>
+                <w:rFonts w:ascii="Ubuntu" w:hAnsi="Ubuntu"/>
+                <w:color w:val="000000"/>
+                <w:sz w:val="24"/>
+              </w:rPr>
               <w:t xml:space="preserve">32 </w:t>
             </w:r>
           </w:p>
@@ -3027,6 +3379,11 @@
           </w:tcPr>
           <w:p>
             <w:r>
+              <w:rPr>
+                <w:rFonts w:ascii="Ubuntu" w:hAnsi="Ubuntu"/>
+                <w:color w:val="000000"/>
+                <w:sz w:val="24"/>
+              </w:rPr>
               <w:t xml:space="preserve">91 </w:t>
             </w:r>
           </w:p>
@@ -3037,6 +3394,11 @@
           </w:tcPr>
           <w:p>
             <w:r>
+              <w:rPr>
+                <w:rFonts w:ascii="Ubuntu" w:hAnsi="Ubuntu"/>
+                <w:color w:val="000000"/>
+                <w:sz w:val="24"/>
+              </w:rPr>
               <w:t xml:space="preserve">— </w:t>
             </w:r>
           </w:p>
@@ -3055,6 +3417,11 @@
           </w:tcPr>
           <w:p>
             <w:r>
+              <w:rPr>
+                <w:rFonts w:ascii="Ubuntu" w:hAnsi="Ubuntu"/>
+                <w:color w:val="000000"/>
+                <w:sz w:val="24"/>
+              </w:rPr>
               <w:t xml:space="preserve">Point E </w:t>
             </w:r>
           </w:p>
@@ -3065,6 +3432,11 @@
           </w:tcPr>
           <w:p>
             <w:r>
+              <w:rPr>
+                <w:rFonts w:ascii="Ubuntu" w:hAnsi="Ubuntu"/>
+                <w:color w:val="000000"/>
+                <w:sz w:val="24"/>
+              </w:rPr>
               <w:t xml:space="preserve">93 </w:t>
             </w:r>
           </w:p>
@@ -3075,6 +3447,11 @@
           </w:tcPr>
           <w:p>
             <w:r>
+              <w:rPr>
+                <w:rFonts w:ascii="Ubuntu" w:hAnsi="Ubuntu"/>
+                <w:color w:val="000000"/>
+                <w:sz w:val="24"/>
+              </w:rPr>
               <w:t xml:space="preserve">35 </w:t>
             </w:r>
           </w:p>
@@ -3085,6 +3462,11 @@
           </w:tcPr>
           <w:p>
             <w:r>
+              <w:rPr>
+                <w:rFonts w:ascii="Ubuntu" w:hAnsi="Ubuntu"/>
+                <w:color w:val="000000"/>
+                <w:sz w:val="24"/>
+              </w:rPr>
               <w:t xml:space="preserve">54 </w:t>
             </w:r>
           </w:p>
@@ -3095,6 +3477,11 @@
           </w:tcPr>
           <w:p>
             <w:r>
+              <w:rPr>
+                <w:rFonts w:ascii="Ubuntu" w:hAnsi="Ubuntu"/>
+                <w:color w:val="000000"/>
+                <w:sz w:val="24"/>
+              </w:rPr>
               <w:t xml:space="preserve">43 </w:t>
             </w:r>
           </w:p>
@@ -3105,6 +3492,11 @@
           </w:tcPr>
           <w:p>
             <w:r>
+              <w:rPr>
+                <w:rFonts w:ascii="Ubuntu" w:hAnsi="Ubuntu"/>
+                <w:color w:val="000000"/>
+                <w:sz w:val="24"/>
+              </w:rPr>
               <w:t xml:space="preserve">— </w:t>
             </w:r>
           </w:p>
@@ -3145,6 +3537,11 @@
           </w:tcPr>
           <w:p>
             <w:r>
+              <w:rPr>
+                <w:rFonts w:ascii="Ubuntu" w:hAnsi="Ubuntu"/>
+                <w:color w:val="000000"/>
+                <w:sz w:val="24"/>
+              </w:rPr>
               <w:t xml:space="preserve">Next, we see a table with special formatting in various locations. Notice how the formatting for the header row and sub header rows is preserved. </w:t>
             </w:r>
           </w:p>
@@ -3183,6 +3580,12 @@
           </w:tcPr>
           <w:p>
             <w:r>
+              <w:rPr>
+                <w:rFonts w:ascii="Ubuntu" w:hAnsi="Ubuntu"/>
+                <w:b/>
+                <w:color w:val="FFFFFF"/>
+                <w:sz w:val="24"/>
+              </w:rPr>
               <w:t xml:space="preserve">College </w:t>
             </w:r>
           </w:p>
@@ -3193,6 +3596,12 @@
           </w:tcPr>
           <w:p>
             <w:r>
+              <w:rPr>
+                <w:rFonts w:ascii="Ubuntu" w:hAnsi="Ubuntu"/>
+                <w:b/>
+                <w:color w:val="FFFFFF"/>
+                <w:sz w:val="24"/>
+              </w:rPr>
               <w:t xml:space="preserve">New students </w:t>
             </w:r>
           </w:p>
@@ -3203,6 +3612,12 @@
           </w:tcPr>
           <w:p>
             <w:r>
+              <w:rPr>
+                <w:rFonts w:ascii="Ubuntu" w:hAnsi="Ubuntu"/>
+                <w:b/>
+                <w:color w:val="FFFFFF"/>
+                <w:sz w:val="24"/>
+              </w:rPr>
               <w:t xml:space="preserve">Graduating students </w:t>
             </w:r>
           </w:p>
@@ -3213,6 +3628,12 @@
           </w:tcPr>
           <w:p>
             <w:r>
+              <w:rPr>
+                <w:rFonts w:ascii="Ubuntu" w:hAnsi="Ubuntu"/>
+                <w:b/>
+                <w:color w:val="FFFFFF"/>
+                <w:sz w:val="24"/>
+              </w:rPr>
               <w:t xml:space="preserve">Change </w:t>
             </w:r>
           </w:p>
@@ -3231,6 +3652,12 @@
           </w:tcPr>
           <w:p>
             <w:r>
+              <w:rPr>
+                <w:rFonts w:ascii="Ubuntu" w:hAnsi="Ubuntu"/>
+                <w:i/>
+                <w:color w:val="808080"/>
+                <w:sz w:val="24"/>
+              </w:rPr>
               <w:t xml:space="preserve">Undergraduate</w:t>
             </w:r>
           </w:p>
@@ -3265,6 +3692,11 @@
           </w:tcPr>
           <w:p>
             <w:r>
+              <w:rPr>
+                <w:rFonts w:ascii="Ubuntu" w:hAnsi="Ubuntu"/>
+                <w:color w:val="000000"/>
+                <w:sz w:val="24"/>
+              </w:rPr>
               <w:t xml:space="preserve">Cedar University </w:t>
             </w:r>
           </w:p>
@@ -3275,6 +3707,10 @@
           </w:tcPr>
           <w:p>
             <w:r>
+              <w:rPr>
+                <w:rFonts w:ascii="Ubuntu" w:hAnsi="Ubuntu"/>
+                <w:color w:val="000000"/>
+              </w:rPr>
               <w:t xml:space="preserve">110 </w:t>
             </w:r>
           </w:p>
@@ -3285,6 +3721,10 @@
           </w:tcPr>
           <w:p>
             <w:r>
+              <w:rPr>
+                <w:rFonts w:ascii="Ubuntu" w:hAnsi="Ubuntu"/>
+                <w:color w:val="000000"/>
+              </w:rPr>
               <w:t xml:space="preserve">103 </w:t>
             </w:r>
           </w:p>
@@ -3295,6 +3735,10 @@
           </w:tcPr>
           <w:p>
             <w:r>
+              <w:rPr>
+                <w:rFonts w:ascii="Ubuntu" w:hAnsi="Ubuntu"/>
+                <w:color w:val="000000"/>
+              </w:rPr>
               <w:t xml:space="preserve">+7 </w:t>
             </w:r>
           </w:p>
@@ -3307,6 +3751,11 @@
           </w:tcPr>
           <w:p>
             <w:r>
+              <w:rPr>
+                <w:rFonts w:ascii="Ubuntu" w:hAnsi="Ubuntu"/>
+                <w:color w:val="000000"/>
+                <w:sz w:val="24"/>
+              </w:rPr>
               <w:t xml:space="preserve">Oak Institute </w:t>
             </w:r>
           </w:p>
@@ -3317,6 +3766,10 @@
           </w:tcPr>
           <w:p>
             <w:r>
+              <w:rPr>
+                <w:rFonts w:ascii="Ubuntu" w:hAnsi="Ubuntu"/>
+                <w:color w:val="000000"/>
+              </w:rPr>
               <w:t xml:space="preserve">202 </w:t>
             </w:r>
           </w:p>
@@ -3327,6 +3780,10 @@
           </w:tcPr>
           <w:p>
             <w:r>
+              <w:rPr>
+                <w:rFonts w:ascii="Ubuntu" w:hAnsi="Ubuntu"/>
+                <w:color w:val="000000"/>
+              </w:rPr>
               <w:t xml:space="preserve">210 </w:t>
             </w:r>
           </w:p>
@@ -3337,6 +3794,10 @@
           </w:tcPr>
           <w:p>
             <w:r>
+              <w:rPr>
+                <w:rFonts w:ascii="Ubuntu" w:hAnsi="Ubuntu"/>
+                <w:color w:val="000000"/>
+              </w:rPr>
               <w:t xml:space="preserve">-8 </w:t>
             </w:r>
           </w:p>
@@ -3355,6 +3816,12 @@
           </w:tcPr>
           <w:p>
             <w:r>
+              <w:rPr>
+                <w:rFonts w:ascii="Ubuntu" w:hAnsi="Ubuntu"/>
+                <w:i/>
+                <w:color w:val="808080"/>
+                <w:sz w:val="24"/>
+              </w:rPr>
               <w:t xml:space="preserve">Graduate</w:t>
             </w:r>
           </w:p>
@@ -3389,6 +3856,11 @@
           </w:tcPr>
           <w:p>
             <w:r>
+              <w:rPr>
+                <w:rFonts w:ascii="Ubuntu" w:hAnsi="Ubuntu"/>
+                <w:color w:val="000000"/>
+                <w:sz w:val="24"/>
+              </w:rPr>
               <w:t xml:space="preserve">Cedar University </w:t>
             </w:r>
           </w:p>
@@ -3399,6 +3871,10 @@
           </w:tcPr>
           <w:p>
             <w:r>
+              <w:rPr>
+                <w:rFonts w:ascii="Ubuntu" w:hAnsi="Ubuntu"/>
+                <w:color w:val="000000"/>
+              </w:rPr>
               <w:t xml:space="preserve">24 </w:t>
             </w:r>
           </w:p>
@@ -3409,6 +3885,10 @@
           </w:tcPr>
           <w:p>
             <w:r>
+              <w:rPr>
+                <w:rFonts w:ascii="Ubuntu" w:hAnsi="Ubuntu"/>
+                <w:color w:val="000000"/>
+              </w:rPr>
               <w:t xml:space="preserve">20 </w:t>
             </w:r>
           </w:p>
@@ -3419,6 +3899,10 @@
           </w:tcPr>
           <w:p>
             <w:r>
+              <w:rPr>
+                <w:rFonts w:ascii="Ubuntu" w:hAnsi="Ubuntu"/>
+                <w:color w:val="000000"/>
+              </w:rPr>
               <w:t xml:space="preserve">+4 </w:t>
             </w:r>
           </w:p>
@@ -3431,6 +3915,11 @@
           </w:tcPr>
           <w:p>
             <w:r>
+              <w:rPr>
+                <w:rFonts w:ascii="Ubuntu" w:hAnsi="Ubuntu"/>
+                <w:color w:val="000000"/>
+                <w:sz w:val="24"/>
+              </w:rPr>
               <w:t xml:space="preserve">Elm College </w:t>
             </w:r>
           </w:p>
@@ -3441,6 +3930,10 @@
           </w:tcPr>
           <w:p>
             <w:r>
+              <w:rPr>
+                <w:rFonts w:ascii="Ubuntu" w:hAnsi="Ubuntu"/>
+                <w:color w:val="000000"/>
+              </w:rPr>
               <w:t xml:space="preserve">43 </w:t>
             </w:r>
           </w:p>
@@ -3451,6 +3944,10 @@
           </w:tcPr>
           <w:p>
             <w:r>
+              <w:rPr>
+                <w:rFonts w:ascii="Ubuntu" w:hAnsi="Ubuntu"/>
+                <w:color w:val="000000"/>
+              </w:rPr>
               <w:t xml:space="preserve">53 </w:t>
             </w:r>
           </w:p>
@@ -3461,6 +3958,10 @@
           </w:tcPr>
           <w:p>
             <w:r>
+              <w:rPr>
+                <w:rFonts w:ascii="Ubuntu" w:hAnsi="Ubuntu"/>
+                <w:color w:val="000000"/>
+              </w:rPr>
               <w:t xml:space="preserve">-10 </w:t>
             </w:r>
           </w:p>
@@ -3473,6 +3974,11 @@
           </w:tcPr>
           <w:p>
             <w:r>
+              <w:rPr>
+                <w:rFonts w:ascii="Ubuntu" w:hAnsi="Ubuntu"/>
+                <w:color w:val="000000"/>
+                <w:sz w:val="24"/>
+              </w:rPr>
               <w:t xml:space="preserve">Total </w:t>
             </w:r>
           </w:p>
@@ -3483,6 +3989,10 @@
           </w:tcPr>
           <w:p>
             <w:r>
+              <w:rPr>
+                <w:rFonts w:ascii="Ubuntu" w:hAnsi="Ubuntu"/>
+                <w:color w:val="000000"/>
+              </w:rPr>
               <w:t xml:space="preserve">998 </w:t>
             </w:r>
           </w:p>
@@ -3493,6 +4003,10 @@
           </w:tcPr>
           <w:p>
             <w:r>
+              <w:rPr>
+                <w:rFonts w:ascii="Ubuntu" w:hAnsi="Ubuntu"/>
+                <w:color w:val="000000"/>
+              </w:rPr>
               <w:t xml:space="preserve">908 </w:t>
             </w:r>
           </w:p>
@@ -3503,6 +4017,10 @@
           </w:tcPr>
           <w:p>
             <w:r>
+              <w:rPr>
+                <w:rFonts w:ascii="Ubuntu" w:hAnsi="Ubuntu"/>
+                <w:color w:val="000000"/>
+              </w:rPr>
               <w:t xml:space="preserve">90 </w:t>
             </w:r>
           </w:p>
@@ -3567,6 +4085,12 @@
           </w:tcPr>
           <w:p>
             <w:r>
+              <w:rPr>
+                <w:rFonts w:ascii="Ubuntu" w:hAnsi="Ubuntu"/>
+                <w:i/>
+                <w:color w:val="808080"/>
+                <w:sz w:val="20"/>
+              </w:rPr>
               <w:t xml:space="preserve">Source:</w:t>
             </w:r>
           </w:p>
@@ -3667,6 +4191,11 @@
           </w:tcPr>
           <w:p>
             <w:r>
+              <w:rPr>
+                <w:rFonts w:ascii="Ubuntu" w:hAnsi="Ubuntu"/>
+                <w:color w:val="000000"/>
+                <w:sz w:val="24"/>
+              </w:rPr>
               <w:t xml:space="preserve">Next, we have something a little more complex, a nested table, i.e. a table inside another table. Additionally, the inner table has some of its cells merged. The table is displayed horizontally centered. </w:t>
             </w:r>
           </w:p>
@@ -3705,6 +4234,11 @@
           </w:tcPr>
           <w:p>
             <w:r>
+              <w:rPr>
+                <w:rFonts w:ascii="Ubuntu" w:hAnsi="Ubuntu"/>
+                <w:color w:val="000000"/>
+                <w:sz w:val="24"/>
+              </w:rPr>
               <w:t xml:space="preserve">One </w:t>
             </w:r>
           </w:p>
@@ -3715,6 +4249,11 @@
           </w:tcPr>
           <w:p>
             <w:r>
+              <w:rPr>
+                <w:rFonts w:ascii="Ubuntu" w:hAnsi="Ubuntu"/>
+                <w:color w:val="000000"/>
+                <w:sz w:val="24"/>
+              </w:rPr>
               <w:t xml:space="preserve">Two </w:t>
             </w:r>
           </w:p>
@@ -3725,6 +4264,11 @@
           </w:tcPr>
           <w:p>
             <w:r>
+              <w:rPr>
+                <w:rFonts w:ascii="Ubuntu" w:hAnsi="Ubuntu"/>
+                <w:color w:val="000000"/>
+                <w:sz w:val="24"/>
+              </w:rPr>
               <w:t xml:space="preserve">To the left is a table inside a table, with some cells merged. </w:t>
             </w:r>
           </w:p>
@@ -3737,6 +4281,11 @@
           </w:tcPr>
           <w:p>
             <w:r>
+              <w:rPr>
+                <w:rFonts w:ascii="Ubuntu" w:hAnsi="Ubuntu"/>
+                <w:color w:val="000000"/>
+                <w:sz w:val="24"/>
+              </w:rPr>
               <w:t xml:space="preserve">Three </w:t>
             </w:r>
           </w:p>
@@ -3755,6 +4304,11 @@
           </w:tcPr>
           <w:p>
             <w:r>
+              <w:rPr>
+                <w:rFonts w:ascii="Ubuntu" w:hAnsi="Ubuntu"/>
+                <w:color w:val="000000"/>
+                <w:sz w:val="24"/>
+              </w:rPr>
               <w:t xml:space="preserve">Four </w:t>
             </w:r>
           </w:p>
@@ -3813,6 +4367,11 @@
           </w:tcPr>
           <w:p>
             <w:r>
+              <w:rPr>
+                <w:rFonts w:ascii="Ubuntu" w:hAnsi="Ubuntu"/>
+                <w:color w:val="000000"/>
+                <w:sz w:val="24"/>
+              </w:rPr>
               <w:t xml:space="preserve">We end with a fancy calendar, note how much of the original formatting is preserved. Note that this table will only display correctly on relatively wide screens. In general, very wide tables or tables whose cells have fixed width requirements don’t fare well in ebooks. </w:t>
             </w:r>
           </w:p>
@@ -3912,6 +4471,11 @@
           </w:tcPr>
           <w:p>
             <w:r>
+              <w:rPr>
+                <w:rFonts w:ascii="Ubuntu" w:hAnsi="Ubuntu"/>
+                <w:color w:val="365F91"/>
+                <w:sz w:val="24"/>
+              </w:rPr>
               <w:t xml:space="preserve">December 2007 </w:t>
             </w:r>
           </w:p>
@@ -3924,6 +4488,11 @@
           </w:tcPr>
           <w:p>
             <w:r>
+              <w:rPr>
+                <w:rFonts w:ascii="Ubuntu" w:hAnsi="Ubuntu"/>
+                <w:color w:val="365F91"/>
+                <w:sz w:val="24"/>
+              </w:rPr>
               <w:t xml:space="preserve">Sun </w:t>
             </w:r>
           </w:p>
@@ -3940,6 +4509,11 @@
           </w:tcPr>
           <w:p>
             <w:r>
+              <w:rPr>
+                <w:rFonts w:ascii="Ubuntu" w:hAnsi="Ubuntu"/>
+                <w:color w:val="7F7F7F"/>
+                <w:sz w:val="24"/>
+              </w:rPr>
               <w:t xml:space="preserve">Mon </w:t>
             </w:r>
           </w:p>
@@ -3956,6 +4530,11 @@
           </w:tcPr>
           <w:p>
             <w:r>
+              <w:rPr>
+                <w:rFonts w:ascii="Ubuntu" w:hAnsi="Ubuntu"/>
+                <w:color w:val="7F7F7F"/>
+                <w:sz w:val="24"/>
+              </w:rPr>
               <w:t xml:space="preserve">Tue </w:t>
             </w:r>
           </w:p>
@@ -3972,6 +4551,11 @@
           </w:tcPr>
           <w:p>
             <w:r>
+              <w:rPr>
+                <w:rFonts w:ascii="Ubuntu" w:hAnsi="Ubuntu"/>
+                <w:color w:val="7F7F7F"/>
+                <w:sz w:val="24"/>
+              </w:rPr>
               <w:t xml:space="preserve">Wed </w:t>
             </w:r>
           </w:p>
@@ -3988,6 +4572,11 @@
           </w:tcPr>
           <w:p>
             <w:r>
+              <w:rPr>
+                <w:rFonts w:ascii="Ubuntu" w:hAnsi="Ubuntu"/>
+                <w:color w:val="7F7F7F"/>
+                <w:sz w:val="24"/>
+              </w:rPr>
               <w:t xml:space="preserve">Thu </w:t>
             </w:r>
           </w:p>
@@ -4004,6 +4593,11 @@
           </w:tcPr>
           <w:p>
             <w:r>
+              <w:rPr>
+                <w:rFonts w:ascii="Ubuntu" w:hAnsi="Ubuntu"/>
+                <w:color w:val="7F7F7F"/>
+                <w:sz w:val="24"/>
+              </w:rPr>
               <w:t xml:space="preserve">Fri </w:t>
             </w:r>
           </w:p>
@@ -4021,6 +4615,11 @@
           </w:tcPr>
           <w:p>
             <w:r>
+              <w:rPr>
+                <w:rFonts w:ascii="Ubuntu" w:hAnsi="Ubuntu"/>
+                <w:color w:val="7F7F7F"/>
+                <w:sz w:val="24"/>
+              </w:rPr>
               <w:t xml:space="preserve">Sat </w:t>
             </w:r>
           </w:p>
@@ -4106,6 +4705,11 @@
           </w:tcPr>
           <w:p>
             <w:r>
+              <w:rPr>
+                <w:rFonts w:ascii="Ubuntu" w:hAnsi="Ubuntu"/>
+                <w:color w:val="7F7F7F"/>
+                <w:sz w:val="24"/>
+              </w:rPr>
               <w:t xml:space="preserve">1 </w:t>
             </w:r>
           </w:p>
@@ -4199,6 +4803,11 @@
           </w:tcPr>
           <w:p>
             <w:r>
+              <w:rPr>
+                <w:rFonts w:ascii="Ubuntu" w:hAnsi="Ubuntu"/>
+                <w:color w:val="365F91"/>
+                <w:sz w:val="24"/>
+              </w:rPr>
               <w:t xml:space="preserve">2 </w:t>
             </w:r>
           </w:p>
@@ -4215,6 +4824,11 @@
           </w:tcPr>
           <w:p>
             <w:r>
+              <w:rPr>
+                <w:rFonts w:ascii="Ubuntu" w:hAnsi="Ubuntu"/>
+                <w:color w:val="7F7F7F"/>
+                <w:sz w:val="24"/>
+              </w:rPr>
               <w:t xml:space="preserve">3 </w:t>
             </w:r>
           </w:p>
@@ -4231,6 +4845,11 @@
           </w:tcPr>
           <w:p>
             <w:r>
+              <w:rPr>
+                <w:rFonts w:ascii="Ubuntu" w:hAnsi="Ubuntu"/>
+                <w:color w:val="7F7F7F"/>
+                <w:sz w:val="24"/>
+              </w:rPr>
               <w:t xml:space="preserve">4 </w:t>
             </w:r>
           </w:p>
@@ -4247,6 +4866,11 @@
           </w:tcPr>
           <w:p>
             <w:r>
+              <w:rPr>
+                <w:rFonts w:ascii="Ubuntu" w:hAnsi="Ubuntu"/>
+                <w:color w:val="7F7F7F"/>
+                <w:sz w:val="24"/>
+              </w:rPr>
               <w:t xml:space="preserve">5 </w:t>
             </w:r>
           </w:p>
@@ -4263,6 +4887,11 @@
           </w:tcPr>
           <w:p>
             <w:r>
+              <w:rPr>
+                <w:rFonts w:ascii="Ubuntu" w:hAnsi="Ubuntu"/>
+                <w:color w:val="7F7F7F"/>
+                <w:sz w:val="24"/>
+              </w:rPr>
               <w:t xml:space="preserve">6 </w:t>
             </w:r>
           </w:p>
@@ -4279,6 +4908,11 @@
           </w:tcPr>
           <w:p>
             <w:r>
+              <w:rPr>
+                <w:rFonts w:ascii="Ubuntu" w:hAnsi="Ubuntu"/>
+                <w:color w:val="7F7F7F"/>
+                <w:sz w:val="24"/>
+              </w:rPr>
               <w:t xml:space="preserve">7 </w:t>
             </w:r>
           </w:p>
@@ -4296,6 +4930,11 @@
           </w:tcPr>
           <w:p>
             <w:r>
+              <w:rPr>
+                <w:rFonts w:ascii="Ubuntu" w:hAnsi="Ubuntu"/>
+                <w:color w:val="7F7F7F"/>
+                <w:sz w:val="24"/>
+              </w:rPr>
               <w:t xml:space="preserve">8 </w:t>
             </w:r>
           </w:p>
@@ -4389,6 +5028,11 @@
           </w:tcPr>
           <w:p>
             <w:r>
+              <w:rPr>
+                <w:rFonts w:ascii="Ubuntu" w:hAnsi="Ubuntu"/>
+                <w:color w:val="365F91"/>
+                <w:sz w:val="24"/>
+              </w:rPr>
               <w:t xml:space="preserve">9 </w:t>
             </w:r>
           </w:p>
@@ -4405,6 +5049,11 @@
           </w:tcPr>
           <w:p>
             <w:r>
+              <w:rPr>
+                <w:rFonts w:ascii="Ubuntu" w:hAnsi="Ubuntu"/>
+                <w:color w:val="7F7F7F"/>
+                <w:sz w:val="24"/>
+              </w:rPr>
               <w:t xml:space="preserve">10 </w:t>
             </w:r>
           </w:p>
@@ -4421,6 +5070,11 @@
           </w:tcPr>
           <w:p>
             <w:r>
+              <w:rPr>
+                <w:rFonts w:ascii="Ubuntu" w:hAnsi="Ubuntu"/>
+                <w:color w:val="7F7F7F"/>
+                <w:sz w:val="24"/>
+              </w:rPr>
               <w:t xml:space="preserve">11 </w:t>
             </w:r>
           </w:p>
@@ -4437,6 +5091,11 @@
           </w:tcPr>
           <w:p>
             <w:r>
+              <w:rPr>
+                <w:rFonts w:ascii="Ubuntu" w:hAnsi="Ubuntu"/>
+                <w:color w:val="7F7F7F"/>
+                <w:sz w:val="24"/>
+              </w:rPr>
               <w:t xml:space="preserve">12 </w:t>
             </w:r>
           </w:p>
@@ -4453,6 +5112,11 @@
           </w:tcPr>
           <w:p>
             <w:r>
+              <w:rPr>
+                <w:rFonts w:ascii="Ubuntu" w:hAnsi="Ubuntu"/>
+                <w:color w:val="7F7F7F"/>
+                <w:sz w:val="24"/>
+              </w:rPr>
               <w:t xml:space="preserve">13 </w:t>
             </w:r>
           </w:p>
@@ -4469,6 +5133,11 @@
           </w:tcPr>
           <w:p>
             <w:r>
+              <w:rPr>
+                <w:rFonts w:ascii="Ubuntu" w:hAnsi="Ubuntu"/>
+                <w:color w:val="7F7F7F"/>
+                <w:sz w:val="24"/>
+              </w:rPr>
               <w:t xml:space="preserve">14 </w:t>
             </w:r>
           </w:p>
@@ -4486,6 +5155,11 @@
           </w:tcPr>
           <w:p>
             <w:r>
+              <w:rPr>
+                <w:rFonts w:ascii="Ubuntu" w:hAnsi="Ubuntu"/>
+                <w:color w:val="7F7F7F"/>
+                <w:sz w:val="24"/>
+              </w:rPr>
               <w:t xml:space="preserve">15 </w:t>
             </w:r>
           </w:p>
@@ -4579,6 +5253,11 @@
           </w:tcPr>
           <w:p>
             <w:r>
+              <w:rPr>
+                <w:rFonts w:ascii="Ubuntu" w:hAnsi="Ubuntu"/>
+                <w:color w:val="365F91"/>
+                <w:sz w:val="24"/>
+              </w:rPr>
               <w:t xml:space="preserve">16 </w:t>
             </w:r>
           </w:p>
@@ -4595,6 +5274,11 @@
           </w:tcPr>
           <w:p>
             <w:r>
+              <w:rPr>
+                <w:rFonts w:ascii="Ubuntu" w:hAnsi="Ubuntu"/>
+                <w:color w:val="7F7F7F"/>
+                <w:sz w:val="24"/>
+              </w:rPr>
               <w:t xml:space="preserve">17 </w:t>
             </w:r>
           </w:p>
@@ -4611,6 +5295,11 @@
           </w:tcPr>
           <w:p>
             <w:r>
+              <w:rPr>
+                <w:rFonts w:ascii="Ubuntu" w:hAnsi="Ubuntu"/>
+                <w:color w:val="7F7F7F"/>
+                <w:sz w:val="24"/>
+              </w:rPr>
               <w:t xml:space="preserve">18 </w:t>
             </w:r>
           </w:p>
@@ -4627,6 +5316,11 @@
           </w:tcPr>
           <w:p>
             <w:r>
+              <w:rPr>
+                <w:rFonts w:ascii="Ubuntu" w:hAnsi="Ubuntu"/>
+                <w:color w:val="7F7F7F"/>
+                <w:sz w:val="24"/>
+              </w:rPr>
               <w:t xml:space="preserve">19 </w:t>
             </w:r>
           </w:p>
@@ -4643,6 +5337,11 @@
           </w:tcPr>
           <w:p>
             <w:r>
+              <w:rPr>
+                <w:rFonts w:ascii="Ubuntu" w:hAnsi="Ubuntu"/>
+                <w:color w:val="7F7F7F"/>
+                <w:sz w:val="24"/>
+              </w:rPr>
               <w:t xml:space="preserve">20 </w:t>
             </w:r>
           </w:p>
@@ -4659,6 +5358,11 @@
           </w:tcPr>
           <w:p>
             <w:r>
+              <w:rPr>
+                <w:rFonts w:ascii="Ubuntu" w:hAnsi="Ubuntu"/>
+                <w:color w:val="7F7F7F"/>
+                <w:sz w:val="24"/>
+              </w:rPr>
               <w:t xml:space="preserve">21 </w:t>
             </w:r>
           </w:p>
@@ -4676,6 +5380,11 @@
           </w:tcPr>
           <w:p>
             <w:r>
+              <w:rPr>
+                <w:rFonts w:ascii="Ubuntu" w:hAnsi="Ubuntu"/>
+                <w:color w:val="7F7F7F"/>
+                <w:sz w:val="24"/>
+              </w:rPr>
               <w:t xml:space="preserve">22 </w:t>
             </w:r>
           </w:p>
@@ -4769,6 +5478,11 @@
           </w:tcPr>
           <w:p>
             <w:r>
+              <w:rPr>
+                <w:rFonts w:ascii="Ubuntu" w:hAnsi="Ubuntu"/>
+                <w:color w:val="365F91"/>
+                <w:sz w:val="24"/>
+              </w:rPr>
               <w:t xml:space="preserve">23 </w:t>
             </w:r>
           </w:p>
@@ -4785,6 +5499,11 @@
           </w:tcPr>
           <w:p>
             <w:r>
+              <w:rPr>
+                <w:rFonts w:ascii="Ubuntu" w:hAnsi="Ubuntu"/>
+                <w:color w:val="7F7F7F"/>
+                <w:sz w:val="24"/>
+              </w:rPr>
               <w:t xml:space="preserve">24 </w:t>
             </w:r>
           </w:p>
@@ -4801,6 +5520,11 @@
           </w:tcPr>
           <w:p>
             <w:r>
+              <w:rPr>
+                <w:rFonts w:ascii="Ubuntu" w:hAnsi="Ubuntu"/>
+                <w:color w:val="7F7F7F"/>
+                <w:sz w:val="24"/>
+              </w:rPr>
               <w:t xml:space="preserve">25 </w:t>
             </w:r>
           </w:p>
@@ -4817,6 +5541,11 @@
           </w:tcPr>
           <w:p>
             <w:r>
+              <w:rPr>
+                <w:rFonts w:ascii="Ubuntu" w:hAnsi="Ubuntu"/>
+                <w:color w:val="7F7F7F"/>
+                <w:sz w:val="24"/>
+              </w:rPr>
               <w:t xml:space="preserve">26 </w:t>
             </w:r>
           </w:p>
@@ -4833,6 +5562,11 @@
           </w:tcPr>
           <w:p>
             <w:r>
+              <w:rPr>
+                <w:rFonts w:ascii="Ubuntu" w:hAnsi="Ubuntu"/>
+                <w:color w:val="7F7F7F"/>
+                <w:sz w:val="24"/>
+              </w:rPr>
               <w:t xml:space="preserve">27 </w:t>
             </w:r>
           </w:p>
@@ -4849,6 +5583,11 @@
           </w:tcPr>
           <w:p>
             <w:r>
+              <w:rPr>
+                <w:rFonts w:ascii="Ubuntu" w:hAnsi="Ubuntu"/>
+                <w:color w:val="7F7F7F"/>
+                <w:sz w:val="24"/>
+              </w:rPr>
               <w:t xml:space="preserve">28 </w:t>
             </w:r>
           </w:p>
@@ -4866,6 +5605,11 @@
           </w:tcPr>
           <w:p>
             <w:r>
+              <w:rPr>
+                <w:rFonts w:ascii="Ubuntu" w:hAnsi="Ubuntu"/>
+                <w:color w:val="7F7F7F"/>
+                <w:sz w:val="24"/>
+              </w:rPr>
               <w:t xml:space="preserve">29 </w:t>
             </w:r>
           </w:p>
@@ -4959,6 +5703,11 @@
           </w:tcPr>
           <w:p>
             <w:r>
+              <w:rPr>
+                <w:rFonts w:ascii="Ubuntu" w:hAnsi="Ubuntu"/>
+                <w:color w:val="365F91"/>
+                <w:sz w:val="24"/>
+              </w:rPr>
               <w:t xml:space="preserve">30 </w:t>
             </w:r>
           </w:p>
@@ -4975,6 +5724,11 @@
           </w:tcPr>
           <w:p>
             <w:r>
+              <w:rPr>
+                <w:rFonts w:ascii="Ubuntu" w:hAnsi="Ubuntu"/>
+                <w:color w:val="7F7F7F"/>
+                <w:sz w:val="24"/>
+              </w:rPr>
               <w:t xml:space="preserve">31 </w:t>
             </w:r>
           </w:p>
@@ -5067,12 +5821,21 @@
         <w:gridCol w:w="9026"/>
       </w:tblGrid>
       <w:tr>
-        <w:tc>
-          <w:tcPr>
-            <w:tcW w:w="0" w:type="auto"/>
-          </w:tcPr>
-          <w:p>
-            <w:r>
+        <w:trPr>
+          <w:tblHeader/>
+        </w:trPr>
+        <w:tc>
+          <w:tcPr>
+            <w:tcW w:w="0" w:type="auto"/>
+          </w:tcPr>
+          <w:p>
+            <w:r>
+              <w:rPr>
+                <w:rFonts w:ascii="Ubuntu" w:hAnsi="Ubuntu"/>
+                <w:b/>
+                <w:color w:val="365F91"/>
+                <w:sz w:val="28"/>
+              </w:rPr>
               <w:t xml:space="preserve">Structural Elements </w:t>
             </w:r>
           </w:p>
@@ -5093,6 +5856,11 @@
           </w:tcPr>
           <w:p>
             <w:r>
+              <w:rPr>
+                <w:rFonts w:ascii="Ubuntu" w:hAnsi="Ubuntu"/>
+                <w:color w:val="000000"/>
+                <w:sz w:val="24"/>
+              </w:rPr>
               <w:t xml:space="preserve">Miscellaneous structural elements you can add to your document, like footnotes, endnotes, dropcaps and the like.  </w:t>
             </w:r>
           </w:p>
@@ -5105,6 +5873,12 @@
           </w:tcPr>
           <w:p>
             <w:r>
+              <w:rPr>
+                <w:rFonts w:ascii="Ubuntu" w:hAnsi="Ubuntu"/>
+                <w:b/>
+                <w:color w:val="4F81BD"/>
+                <w:sz w:val="26"/>
+              </w:rPr>
               <w:t xml:space="preserve">Footnotes &amp; Endnotes </w:t>
             </w:r>
           </w:p>
@@ -5117,6 +5891,11 @@
           </w:tcPr>
           <w:p>
             <w:r>
+              <w:rPr>
+                <w:rFonts w:ascii="Ubuntu" w:hAnsi="Ubuntu"/>
+                <w:color w:val="000000"/>
+                <w:sz w:val="24"/>
+              </w:rPr>
               <w:t xml:space="preserve">Footnotes</w:t>
             </w:r>
           </w:p>
@@ -5132,6 +5911,11 @@
           </w:p>
           <w:p>
             <w:r>
+              <w:rPr>
+                <w:rFonts w:ascii="Ubuntu" w:hAnsi="Ubuntu"/>
+                <w:color w:val="000000"/>
+                <w:sz w:val="24"/>
+              </w:rPr>
               <w:t xml:space="preserve"> and endnotes</w:t>
             </w:r>
           </w:p>
@@ -5147,6 +5931,11 @@
           </w:p>
           <w:p>
             <w:r>
+              <w:rPr>
+                <w:rFonts w:ascii="Ubuntu" w:hAnsi="Ubuntu"/>
+                <w:color w:val="000000"/>
+                <w:sz w:val="24"/>
+              </w:rPr>
               <w:t xml:space="preserve"> are automatically recognized and both are converted to endnotes, with backlinks for maximum ease of use in ebook devices. </w:t>
             </w:r>
           </w:p>
@@ -5159,6 +5948,12 @@
           </w:tcPr>
           <w:p>
             <w:r>
+              <w:rPr>
+                <w:rFonts w:ascii="Ubuntu" w:hAnsi="Ubuntu"/>
+                <w:b/>
+                <w:color w:val="4F81BD"/>
+                <w:sz w:val="26"/>
+              </w:rPr>
               <w:t xml:space="preserve">Dropcaps </w:t>
             </w:r>
           </w:p>
@@ -5171,6 +5966,11 @@
           </w:tcPr>
           <w:p>
             <w:r>
+              <w:rPr>
+                <w:rFonts w:ascii="Ubuntu" w:hAnsi="Ubuntu"/>
+                <w:color w:val="000000"/>
+                <w:sz w:val="116"/>
+              </w:rPr>
               <w:t xml:space="preserve">D </w:t>
             </w:r>
           </w:p>
@@ -5183,6 +5983,11 @@
           </w:tcPr>
           <w:p>
             <w:r>
+              <w:rPr>
+                <w:rFonts w:ascii="Ubuntu" w:hAnsi="Ubuntu"/>
+                <w:color w:val="000000"/>
+                <w:sz w:val="24"/>
+              </w:rPr>
               <w:t xml:space="preserve">rop caps are used to emphasize the leading paragraph at the start of a section. In Word it is possible to specify how many lines of text a drop-cap should use. </w:t>
             </w:r>
           </w:p>
@@ -5195,6 +6000,12 @@
           </w:tcPr>
           <w:p>
             <w:r>
+              <w:rPr>
+                <w:rFonts w:ascii="Ubuntu" w:hAnsi="Ubuntu"/>
+                <w:b/>
+                <w:color w:val="4F81BD"/>
+                <w:sz w:val="26"/>
+              </w:rPr>
               <w:t xml:space="preserve">Links </w:t>
             </w:r>
           </w:p>
@@ -5207,6 +6018,11 @@
           </w:tcPr>
           <w:p>
             <w:r>
+              <w:rPr>
+                <w:rFonts w:ascii="Ubuntu" w:hAnsi="Ubuntu"/>
+                <w:color w:val="000000"/>
+                <w:sz w:val="24"/>
+              </w:rPr>
               <w:t xml:space="preserve">Two kinds of links are possible, those that refer to an external website and those that refer to locations inside the document itself. Both are supported by calibre. For example, here is a link pointing to the </w:t>
             </w:r>
           </w:p>
@@ -5223,6 +6039,11 @@
           </w:p>
           <w:p>
             <w:r>
+              <w:rPr>
+                <w:rFonts w:ascii="Ubuntu" w:hAnsi="Ubuntu"/>
+                <w:color w:val="000000"/>
+                <w:sz w:val="24"/>
+              </w:rPr>
               <w:t xml:space="preserve">. Then we have a link that points back to the section on </w:t>
             </w:r>
           </w:p>
@@ -5239,6 +6060,11 @@
           </w:p>
           <w:p>
             <w:r>
+              <w:rPr>
+                <w:rFonts w:ascii="Ubuntu" w:hAnsi="Ubuntu"/>
+                <w:color w:val="000000"/>
+                <w:sz w:val="24"/>
+              </w:rPr>
               <w:t xml:space="preserve"> in this document. </w:t>
             </w:r>
           </w:p>
@@ -5270,12 +6096,21 @@
         <w:gridCol w:w="9026"/>
       </w:tblGrid>
       <w:tr>
-        <w:tc>
-          <w:tcPr>
-            <w:tcW w:w="0" w:type="auto"/>
-          </w:tcPr>
-          <w:p>
-            <w:r>
+        <w:trPr>
+          <w:tblHeader/>
+        </w:trPr>
+        <w:tc>
+          <w:tcPr>
+            <w:tcW w:w="0" w:type="auto"/>
+          </w:tcPr>
+          <w:p>
+            <w:r>
+              <w:rPr>
+                <w:rFonts w:ascii="Ubuntu" w:hAnsi="Ubuntu"/>
+                <w:b/>
+                <w:color w:val="365F91"/>
+                <w:sz w:val="28"/>
+              </w:rPr>
               <w:t xml:space="preserve">Images </w:t>
             </w:r>
           </w:p>
@@ -5288,6 +6123,11 @@
           </w:tcPr>
           <w:p>
             <w:r>
+              <w:rPr>
+                <w:rFonts w:ascii="Ubuntu" w:hAnsi="Ubuntu"/>
+                <w:color w:val="000000"/>
+                <w:sz w:val="24"/>
+              </w:rPr>
               <w:t xml:space="preserve">Centered images like this are useful for large pictures that should be a focus of attention.  </w:t>
             </w:r>
           </w:p>
@@ -5518,6 +6358,11 @@
           </w:tcPr>
           <w:p>
             <w:r>
+              <w:rPr>
+                <w:rFonts w:ascii="Ubuntu" w:hAnsi="Ubuntu"/>
+                <w:color w:val="000000"/>
+                <w:sz w:val="24"/>
+              </w:rPr>
               <w:t xml:space="preserve">There is no analogous technology in ebooks, so the conversion will usually end up placing the image either centered or floating close to the point in the text where it was </w:t>
             </w:r>
           </w:p>
@@ -5534,6 +6379,11 @@
           </w:p>
           <w:p>
             <w:r>
+              <w:rPr>
+                <w:rFonts w:ascii="Ubuntu" w:hAnsi="Ubuntu"/>
+                <w:color w:val="000000"/>
+                <w:sz w:val="24"/>
+              </w:rPr>
               <w:t xml:space="preserve">, not necessarily where it appears on the page in Word. </w:t>
             </w:r>
           </w:p>
@@ -5566,12 +6416,21 @@
         <w:gridCol w:w="4513"/>
       </w:tblGrid>
       <w:tr>
-        <w:tc>
-          <w:tcPr>
-            <w:tcW w:w="0" w:type="auto"/>
-          </w:tcPr>
-          <w:p>
-            <w:r>
+        <w:trPr>
+          <w:tblHeader/>
+        </w:trPr>
+        <w:tc>
+          <w:tcPr>
+            <w:tcW w:w="0" w:type="auto"/>
+          </w:tcPr>
+          <w:p>
+            <w:r>
+              <w:rPr>
+                <w:rFonts w:ascii="Ubuntu" w:hAnsi="Ubuntu"/>
+                <w:b/>
+                <w:color w:val="365F91"/>
+                <w:sz w:val="28"/>
+              </w:rPr>
               <w:t xml:space="preserve">Lists </w:t>
             </w:r>
           </w:p>
@@ -5584,6 +6443,11 @@
           </w:tcPr>
           <w:p>
             <w:r>
+              <w:rPr>
+                <w:rFonts w:ascii="Ubuntu" w:hAnsi="Ubuntu"/>
+                <w:color w:val="000000"/>
+                <w:sz w:val="24"/>
+              </w:rPr>
               <w:t xml:space="preserve">All types of lists are supported by the conversion, with the exception of lists that use fancy bullets, these get converted to regular bullets. </w:t>
             </w:r>
           </w:p>
@@ -5596,6 +6460,12 @@
           </w:tcPr>
           <w:p>
             <w:r>
+              <w:rPr>
+                <w:rFonts w:ascii="Ubuntu" w:hAnsi="Ubuntu"/>
+                <w:b/>
+                <w:color w:val="4F81BD"/>
+                <w:sz w:val="26"/>
+              </w:rPr>
               <w:t xml:space="preserve">Bulleted List </w:t>
             </w:r>
           </w:p>
@@ -5608,6 +6478,11 @@
           </w:tcPr>
           <w:p>
             <w:r>
+              <w:rPr>
+                <w:rFonts w:ascii="Ubuntu" w:hAnsi="Ubuntu"/>
+                <w:color w:val="000000"/>
+                <w:sz w:val="24"/>
+              </w:rPr>
               <w:t xml:space="preserve">One </w:t>
             </w:r>
           </w:p>
@@ -5620,6 +6495,11 @@
           </w:tcPr>
           <w:p>
             <w:r>
+              <w:rPr>
+                <w:rFonts w:ascii="Ubuntu" w:hAnsi="Ubuntu"/>
+                <w:color w:val="000000"/>
+                <w:sz w:val="24"/>
+              </w:rPr>
               <w:t xml:space="preserve">Two </w:t>
             </w:r>
           </w:p>
@@ -5632,6 +6512,12 @@
           </w:tcPr>
           <w:p>
             <w:r>
+              <w:rPr>
+                <w:rFonts w:ascii="Ubuntu" w:hAnsi="Ubuntu"/>
+                <w:b/>
+                <w:color w:val="4F81BD"/>
+                <w:sz w:val="26"/>
+              </w:rPr>
               <w:t xml:space="preserve">Numbered List </w:t>
             </w:r>
           </w:p>
@@ -5644,6 +6530,11 @@
           </w:tcPr>
           <w:p>
             <w:r>
+              <w:rPr>
+                <w:rFonts w:ascii="Ubuntu" w:hAnsi="Ubuntu"/>
+                <w:color w:val="000000"/>
+                <w:sz w:val="24"/>
+              </w:rPr>
               <w:t xml:space="preserve">1</w:t>
             </w:r>
           </w:p>
@@ -5654,6 +6545,11 @@
           </w:tcPr>
           <w:p>
             <w:r>
+              <w:rPr>
+                <w:rFonts w:ascii="Ubuntu" w:hAnsi="Ubuntu"/>
+                <w:color w:val="000000"/>
+                <w:sz w:val="24"/>
+              </w:rPr>
               <w:t xml:space="preserve">One, with a very long line to demonstrate that the hanging indent for the list is working correctly </w:t>
             </w:r>
           </w:p>
@@ -5666,6 +6562,11 @@
           </w:tcPr>
           <w:p>
             <w:r>
+              <w:rPr>
+                <w:rFonts w:ascii="Ubuntu" w:hAnsi="Ubuntu"/>
+                <w:color w:val="000000"/>
+                <w:sz w:val="24"/>
+              </w:rPr>
               <w:t xml:space="preserve">2</w:t>
             </w:r>
           </w:p>
@@ -5676,6 +6577,11 @@
           </w:tcPr>
           <w:p>
             <w:r>
+              <w:rPr>
+                <w:rFonts w:ascii="Ubuntu" w:hAnsi="Ubuntu"/>
+                <w:color w:val="000000"/>
+                <w:sz w:val="24"/>
+              </w:rPr>
               <w:t xml:space="preserve">Two </w:t>
             </w:r>
           </w:p>
@@ -5688,6 +6594,12 @@
           </w:tcPr>
           <w:p>
             <w:r>
+              <w:rPr>
+                <w:rFonts w:ascii="Ubuntu" w:hAnsi="Ubuntu"/>
+                <w:b/>
+                <w:color w:val="4F81BD"/>
+                <w:sz w:val="26"/>
+              </w:rPr>
               <w:t xml:space="preserve">Multi-level Lists </w:t>
             </w:r>
           </w:p>
@@ -5700,6 +6612,11 @@
           </w:tcPr>
           <w:p>
             <w:r>
+              <w:rPr>
+                <w:rFonts w:ascii="Ubuntu" w:hAnsi="Ubuntu"/>
+                <w:color w:val="000000"/>
+                <w:sz w:val="24"/>
+              </w:rPr>
               <w:t xml:space="preserve">1</w:t>
             </w:r>
           </w:p>
@@ -5710,6 +6627,11 @@
           </w:tcPr>
           <w:p>
             <w:r>
+              <w:rPr>
+                <w:rFonts w:ascii="Ubuntu" w:hAnsi="Ubuntu"/>
+                <w:color w:val="000000"/>
+                <w:sz w:val="24"/>
+              </w:rPr>
               <w:t xml:space="preserve">One </w:t>
             </w:r>
           </w:p>
@@ -5722,6 +6644,11 @@
           </w:tcPr>
           <w:p>
             <w:r>
+              <w:rPr>
+                <w:rFonts w:ascii="Ubuntu" w:hAnsi="Ubuntu"/>
+                <w:color w:val="000000"/>
+                <w:sz w:val="24"/>
+              </w:rPr>
               <w:t xml:space="preserve">1</w:t>
             </w:r>
           </w:p>
@@ -5732,6 +6659,11 @@
           </w:tcPr>
           <w:p>
             <w:r>
+              <w:rPr>
+                <w:rFonts w:ascii="Ubuntu" w:hAnsi="Ubuntu"/>
+                <w:color w:val="000000"/>
+                <w:sz w:val="24"/>
+              </w:rPr>
               <w:t xml:space="preserve">Two </w:t>
             </w:r>
           </w:p>
@@ -5744,6 +6676,11 @@
           </w:tcPr>
           <w:p>
             <w:r>
+              <w:rPr>
+                <w:rFonts w:ascii="Ubuntu" w:hAnsi="Ubuntu"/>
+                <w:color w:val="000000"/>
+                <w:sz w:val="24"/>
+              </w:rPr>
               <w:t xml:space="preserve">1</w:t>
             </w:r>
           </w:p>
@@ -5754,6 +6691,11 @@
           </w:tcPr>
           <w:p>
             <w:r>
+              <w:rPr>
+                <w:rFonts w:ascii="Ubuntu" w:hAnsi="Ubuntu"/>
+                <w:color w:val="000000"/>
+                <w:sz w:val="24"/>
+              </w:rPr>
               <w:t xml:space="preserve">Three </w:t>
             </w:r>
           </w:p>
@@ -5766,6 +6708,11 @@
           </w:tcPr>
           <w:p>
             <w:r>
+              <w:rPr>
+                <w:rFonts w:ascii="Ubuntu" w:hAnsi="Ubuntu"/>
+                <w:color w:val="000000"/>
+                <w:sz w:val="24"/>
+              </w:rPr>
               <w:t xml:space="preserve">2</w:t>
             </w:r>
           </w:p>
@@ -5776,6 +6723,11 @@
           </w:tcPr>
           <w:p>
             <w:r>
+              <w:rPr>
+                <w:rFonts w:ascii="Ubuntu" w:hAnsi="Ubuntu"/>
+                <w:color w:val="000000"/>
+                <w:sz w:val="24"/>
+              </w:rPr>
               <w:t xml:space="preserve">Four with a very long line to demonstrate that the hanging indent for the list is working correctly. </w:t>
             </w:r>
           </w:p>
@@ -5788,6 +6740,11 @@
           </w:tcPr>
           <w:p>
             <w:r>
+              <w:rPr>
+                <w:rFonts w:ascii="Ubuntu" w:hAnsi="Ubuntu"/>
+                <w:color w:val="000000"/>
+                <w:sz w:val="24"/>
+              </w:rPr>
               <w:t xml:space="preserve">3</w:t>
             </w:r>
           </w:p>
@@ -5798,6 +6755,11 @@
           </w:tcPr>
           <w:p>
             <w:r>
+              <w:rPr>
+                <w:rFonts w:ascii="Ubuntu" w:hAnsi="Ubuntu"/>
+                <w:color w:val="000000"/>
+                <w:sz w:val="24"/>
+              </w:rPr>
               <w:t xml:space="preserve">Five </w:t>
             </w:r>
           </w:p>
@@ -5810,6 +6772,11 @@
           </w:tcPr>
           <w:p>
             <w:r>
+              <w:rPr>
+                <w:rFonts w:ascii="Ubuntu" w:hAnsi="Ubuntu"/>
+                <w:color w:val="000000"/>
+                <w:sz w:val="24"/>
+              </w:rPr>
               <w:t xml:space="preserve">2</w:t>
             </w:r>
           </w:p>
@@ -5820,6 +6787,11 @@
           </w:tcPr>
           <w:p>
             <w:r>
+              <w:rPr>
+                <w:rFonts w:ascii="Ubuntu" w:hAnsi="Ubuntu"/>
+                <w:color w:val="000000"/>
+                <w:sz w:val="24"/>
+              </w:rPr>
               <w:t xml:space="preserve">Six </w:t>
             </w:r>
           </w:p>
@@ -5832,6 +6804,11 @@
           </w:tcPr>
           <w:p>
             <w:r>
+              <w:rPr>
+                <w:rFonts w:ascii="Ubuntu" w:hAnsi="Ubuntu"/>
+                <w:color w:val="000000"/>
+                <w:sz w:val="24"/>
+              </w:rPr>
               <w:t xml:space="preserve">A Multi-level list with bullets: </w:t>
             </w:r>
           </w:p>
@@ -5844,6 +6821,11 @@
           </w:tcPr>
           <w:p>
             <w:r>
+              <w:rPr>
+                <w:rFonts w:ascii="Ubuntu" w:hAnsi="Ubuntu"/>
+                <w:color w:val="000000"/>
+                <w:sz w:val="24"/>
+              </w:rPr>
               <w:t xml:space="preserve">One </w:t>
             </w:r>
           </w:p>
@@ -5856,6 +6838,11 @@
           </w:tcPr>
           <w:p>
             <w:r>
+              <w:rPr>
+                <w:rFonts w:ascii="Ubuntu" w:hAnsi="Ubuntu"/>
+                <w:color w:val="000000"/>
+                <w:sz w:val="24"/>
+              </w:rPr>
               <w:t xml:space="preserve">Two </w:t>
             </w:r>
           </w:p>
@@ -5868,6 +6855,11 @@
           </w:tcPr>
           <w:p>
             <w:r>
+              <w:rPr>
+                <w:rFonts w:ascii="Ubuntu" w:hAnsi="Ubuntu"/>
+                <w:color w:val="000000"/>
+                <w:sz w:val="24"/>
+              </w:rPr>
               <w:t xml:space="preserve">This bullet uses an image as the bullet item </w:t>
             </w:r>
           </w:p>
@@ -5880,6 +6872,11 @@
           </w:tcPr>
           <w:p>
             <w:r>
+              <w:rPr>
+                <w:rFonts w:ascii="Ubuntu" w:hAnsi="Ubuntu"/>
+                <w:color w:val="000000"/>
+                <w:sz w:val="24"/>
+              </w:rPr>
               <w:t xml:space="preserve">Four </w:t>
             </w:r>
           </w:p>
@@ -5892,6 +6889,11 @@
           </w:tcPr>
           <w:p>
             <w:r>
+              <w:rPr>
+                <w:rFonts w:ascii="Ubuntu" w:hAnsi="Ubuntu"/>
+                <w:color w:val="000000"/>
+                <w:sz w:val="24"/>
+              </w:rPr>
               <w:t xml:space="preserve">Five </w:t>
             </w:r>
           </w:p>
@@ -5904,6 +6906,12 @@
           </w:tcPr>
           <w:p>
             <w:r>
+              <w:rPr>
+                <w:rFonts w:ascii="Ubuntu" w:hAnsi="Ubuntu"/>
+                <w:b/>
+                <w:color w:val="4F81BD"/>
+                <w:sz w:val="26"/>
+              </w:rPr>
               <w:t xml:space="preserve">Continued Lists </w:t>
             </w:r>
           </w:p>
@@ -5916,6 +6924,11 @@
           </w:tcPr>
           <w:p>
             <w:r>
+              <w:rPr>
+                <w:rFonts w:ascii="Ubuntu" w:hAnsi="Ubuntu"/>
+                <w:color w:val="000000"/>
+                <w:sz w:val="24"/>
+              </w:rPr>
               <w:t xml:space="preserve">i</w:t>
             </w:r>
           </w:p>
@@ -5926,6 +6939,11 @@
           </w:tcPr>
           <w:p>
             <w:r>
+              <w:rPr>
+                <w:rFonts w:ascii="Ubuntu" w:hAnsi="Ubuntu"/>
+                <w:color w:val="000000"/>
+                <w:sz w:val="24"/>
+              </w:rPr>
               <w:t xml:space="preserve">One </w:t>
             </w:r>
           </w:p>
@@ -5938,6 +6956,11 @@
           </w:tcPr>
           <w:p>
             <w:r>
+              <w:rPr>
+                <w:rFonts w:ascii="Ubuntu" w:hAnsi="Ubuntu"/>
+                <w:color w:val="000000"/>
+                <w:sz w:val="24"/>
+              </w:rPr>
               <w:t xml:space="preserve">ii</w:t>
             </w:r>
           </w:p>
@@ -5948,6 +6971,11 @@
           </w:tcPr>
           <w:p>
             <w:r>
+              <w:rPr>
+                <w:rFonts w:ascii="Ubuntu" w:hAnsi="Ubuntu"/>
+                <w:color w:val="000000"/>
+                <w:sz w:val="24"/>
+              </w:rPr>
               <w:t xml:space="preserve">Two </w:t>
             </w:r>
           </w:p>
@@ -5960,6 +6988,11 @@
           </w:tcPr>
           <w:p>
             <w:r>
+              <w:rPr>
+                <w:rFonts w:ascii="Ubuntu" w:hAnsi="Ubuntu"/>
+                <w:color w:val="000000"/>
+                <w:sz w:val="24"/>
+              </w:rPr>
               <w:t xml:space="preserve">An interruption in our regularly scheduled listing, for this essential and very relevant public service announcement. </w:t>
             </w:r>
           </w:p>
@@ -5972,6 +7005,11 @@
           </w:tcPr>
           <w:p>
             <w:r>
+              <w:rPr>
+                <w:rFonts w:ascii="Ubuntu" w:hAnsi="Ubuntu"/>
+                <w:color w:val="000000"/>
+                <w:sz w:val="24"/>
+              </w:rPr>
               <w:t xml:space="preserve">iii</w:t>
             </w:r>
           </w:p>
@@ -5982,6 +7020,11 @@
           </w:tcPr>
           <w:p>
             <w:r>
+              <w:rPr>
+                <w:rFonts w:ascii="Ubuntu" w:hAnsi="Ubuntu"/>
+                <w:color w:val="000000"/>
+                <w:sz w:val="24"/>
+              </w:rPr>
               <w:t xml:space="preserve">We now resume our normal programming </w:t>
             </w:r>
           </w:p>
@@ -5994,6 +7037,11 @@
           </w:tcPr>
           <w:p>
             <w:r>
+              <w:rPr>
+                <w:rFonts w:ascii="Ubuntu" w:hAnsi="Ubuntu"/>
+                <w:color w:val="000000"/>
+                <w:sz w:val="24"/>
+              </w:rPr>
               <w:t xml:space="preserve">iv</w:t>
             </w:r>
           </w:p>
@@ -6004,6 +7052,11 @@
           </w:tcPr>
           <w:p>
             <w:r>
+              <w:rPr>
+                <w:rFonts w:ascii="Ubuntu" w:hAnsi="Ubuntu"/>
+                <w:color w:val="000000"/>
+                <w:sz w:val="24"/>
+              </w:rPr>
               <w:t xml:space="preserve">Four </w:t>
             </w:r>
           </w:p>
@@ -6040,12 +7093,21 @@
         <w:gridCol w:w="1504"/>
       </w:tblGrid>
       <w:tr>
-        <w:tc>
-          <w:tcPr>
-            <w:tcW w:w="0" w:type="auto"/>
-          </w:tcPr>
-          <w:p>
-            <w:r>
+        <w:trPr>
+          <w:tblHeader/>
+        </w:trPr>
+        <w:tc>
+          <w:tcPr>
+            <w:tcW w:w="0" w:type="auto"/>
+          </w:tcPr>
+          <w:p>
+            <w:r>
+              <w:rPr>
+                <w:rFonts w:ascii="Ubuntu" w:hAnsi="Ubuntu"/>
+                <w:b/>
+                <w:color w:val="365F91"/>
+                <w:sz w:val="28"/>
+              </w:rPr>
               <w:t xml:space="preserve">Charts</w:t>
             </w:r>
           </w:p>
@@ -6076,6 +7138,9 @@
           </w:tcPr>
           <w:p>
             <w:r>
+              <w:rPr>
+                <w:color w:val="000000"/>
+              </w:rPr>
               <w:t xml:space="preserve">Series 1</w:t>
             </w:r>
           </w:p>
@@ -6086,6 +7151,9 @@
           </w:tcPr>
           <w:p>
             <w:r>
+              <w:rPr>
+                <w:color w:val="000000"/>
+              </w:rPr>
               <w:t xml:space="preserve">Series 2</w:t>
             </w:r>
           </w:p>
@@ -6096,6 +7164,9 @@
           </w:tcPr>
           <w:p>
             <w:r>
+              <w:rPr>
+                <w:color w:val="000000"/>
+              </w:rPr>
               <w:t xml:space="preserve">Series 3</w:t>
             </w:r>
           </w:p>
@@ -6120,6 +7191,9 @@
           </w:tcPr>
           <w:p>
             <w:r>
+              <w:rPr>
+                <w:color w:val="000000"/>
+              </w:rPr>
               <w:t xml:space="preserve">Category 1</w:t>
             </w:r>
           </w:p>
@@ -6130,6 +7204,9 @@
           </w:tcPr>
           <w:p>
             <w:r>
+              <w:rPr>
+                <w:color w:val="000000"/>
+              </w:rPr>
               <w:t xml:space="preserve">4.3</w:t>
             </w:r>
           </w:p>
@@ -6140,6 +7217,9 @@
           </w:tcPr>
           <w:p>
             <w:r>
+              <w:rPr>
+                <w:color w:val="000000"/>
+              </w:rPr>
               <w:t xml:space="preserve">2.4</w:t>
             </w:r>
           </w:p>
@@ -6150,6 +7230,9 @@
           </w:tcPr>
           <w:p>
             <w:r>
+              <w:rPr>
+                <w:color w:val="000000"/>
+              </w:rPr>
               <w:t xml:space="preserve">2</w:t>
             </w:r>
           </w:p>
@@ -6408,6 +7491,9 @@
           </w:tcPr>
           <w:p>
             <w:r>
+              <w:rPr>
+                <w:color w:val="000000"/>
+              </w:rPr>
               <w:t xml:space="preserve">Category 2</w:t>
             </w:r>
           </w:p>
@@ -6418,6 +7504,9 @@
           </w:tcPr>
           <w:p>
             <w:r>
+              <w:rPr>
+                <w:color w:val="000000"/>
+              </w:rPr>
               <w:t xml:space="preserve">2.5</w:t>
             </w:r>
           </w:p>
@@ -6428,6 +7517,9 @@
           </w:tcPr>
           <w:p>
             <w:r>
+              <w:rPr>
+                <w:color w:val="000000"/>
+              </w:rPr>
               <w:t xml:space="preserve">4.4</w:t>
             </w:r>
           </w:p>
@@ -6438,6 +7530,9 @@
           </w:tcPr>
           <w:p>
             <w:r>
+              <w:rPr>
+                <w:color w:val="000000"/>
+              </w:rPr>
               <w:t xml:space="preserve">2</w:t>
             </w:r>
           </w:p>
@@ -6462,6 +7557,9 @@
           </w:tcPr>
           <w:p>
             <w:r>
+              <w:rPr>
+                <w:color w:val="000000"/>
+              </w:rPr>
               <w:t xml:space="preserve">Category 3</w:t>
             </w:r>
           </w:p>
@@ -6472,6 +7570,9 @@
           </w:tcPr>
           <w:p>
             <w:r>
+              <w:rPr>
+                <w:color w:val="000000"/>
+              </w:rPr>
               <w:t xml:space="preserve">3.5</w:t>
             </w:r>
           </w:p>
@@ -6482,6 +7583,9 @@
           </w:tcPr>
           <w:p>
             <w:r>
+              <w:rPr>
+                <w:color w:val="000000"/>
+              </w:rPr>
               <w:t xml:space="preserve">1.8</w:t>
             </w:r>
           </w:p>
@@ -6492,6 +7596,9 @@
           </w:tcPr>
           <w:p>
             <w:r>
+              <w:rPr>
+                <w:color w:val="000000"/>
+              </w:rPr>
               <w:t xml:space="preserve">3</w:t>
             </w:r>
           </w:p>
@@ -6516,6 +7623,9 @@
           </w:tcPr>
           <w:p>
             <w:r>
+              <w:rPr>
+                <w:color w:val="000000"/>
+              </w:rPr>
               <w:t xml:space="preserve">Category 4</w:t>
             </w:r>
           </w:p>
@@ -6526,6 +7636,9 @@
           </w:tcPr>
           <w:p>
             <w:r>
+              <w:rPr>
+                <w:color w:val="000000"/>
+              </w:rPr>
               <w:t xml:space="preserve">4.5</w:t>
             </w:r>
           </w:p>
@@ -6536,6 +7649,9 @@
           </w:tcPr>
           <w:p>
             <w:r>
+              <w:rPr>
+                <w:color w:val="000000"/>
+              </w:rPr>
               <w:t xml:space="preserve">2.8</w:t>
             </w:r>
           </w:p>
@@ -6546,6 +7662,9 @@
           </w:tcPr>
           <w:p>
             <w:r>
+              <w:rPr>
+                <w:color w:val="000000"/>
+              </w:rPr>
               <w:t xml:space="preserve">5</w:t>
             </w:r>
           </w:p>

</xml_diff>